<commit_message>
Redraw all report figures at column width with legible fonts and legends outside the data area; re-layout HW3 draft
Co-Authored-By: Claude Fable 5.1 <noreply@anthropic.com>
Claude-Session: https://claude.ai/code/session_01QFP6ssei1RRu2jM5wMNLRo
</commit_message>
<xml_diff>
--- a/report/HW3_54.docx
+++ b/report/HW3_54.docx
@@ -188,13 +188,13 @@
     <w:p>
       <w:pPr>
         <w:keepNext/>
-        <w:spacing w:after="10" w:before="40"/>
+        <w:spacing w:after="40" w:before="120"/>
         <w:jc w:val="center"/>
       </w:pPr>
       <w:r>
         <w:drawing>
           <wp:inline distT="0" distB="0" distL="0" distR="0">
-            <wp:extent cx="2238375" cy="1857375"/>
+            <wp:extent cx="2943225" cy="2809875"/>
             <wp:effectExtent t="0" r="0" b="0" l="0"/>
             <wp:docPr id="1" name="" descr="" title=""/>
             <wp:cNvGraphicFramePr>
@@ -219,7 +219,7 @@
                   <pic:spPr bwMode="auto">
                     <a:xfrm>
                       <a:off x="0" y="0"/>
-                      <a:ext cx="2238375" cy="1857375"/>
+                      <a:ext cx="2943225" cy="2809875"/>
                     </a:xfrm>
                     <a:prstGeom prst="rect">
                       <a:avLst/>
@@ -234,7 +234,7 @@
     </w:p>
     <w:p>
       <w:pPr>
-        <w:spacing w:after="60" w:before="0" w:line="200"/>
+        <w:spacing w:after="140" w:before="0" w:line="200"/>
         <w:jc w:val="both"/>
       </w:pPr>
       <w:r>
@@ -969,13 +969,13 @@
     <w:p>
       <w:pPr>
         <w:keepNext/>
-        <w:spacing w:after="10" w:before="40"/>
+        <w:spacing w:after="40" w:before="120"/>
         <w:jc w:val="center"/>
       </w:pPr>
       <w:r>
         <w:drawing>
           <wp:inline distT="0" distB="0" distL="0" distR="0">
-            <wp:extent cx="2895600" cy="1085850"/>
+            <wp:extent cx="2943225" cy="1266825"/>
             <wp:effectExtent t="0" r="0" b="0" l="0"/>
             <wp:docPr id="1" name="" descr="" title=""/>
             <wp:cNvGraphicFramePr>
@@ -1000,7 +1000,7 @@
                   <pic:spPr bwMode="auto">
                     <a:xfrm>
                       <a:off x="0" y="0"/>
-                      <a:ext cx="2895600" cy="1085850"/>
+                      <a:ext cx="2943225" cy="1266825"/>
                     </a:xfrm>
                     <a:prstGeom prst="rect">
                       <a:avLst/>
@@ -1015,7 +1015,7 @@
     </w:p>
     <w:p>
       <w:pPr>
-        <w:spacing w:after="60" w:before="0" w:line="200"/>
+        <w:spacing w:after="140" w:before="0" w:line="200"/>
         <w:jc w:val="both"/>
       </w:pPr>
       <w:r>
@@ -1089,13 +1089,13 @@
     <w:p>
       <w:pPr>
         <w:keepNext/>
-        <w:spacing w:after="10" w:before="40"/>
+        <w:spacing w:after="40" w:before="120"/>
         <w:jc w:val="center"/>
       </w:pPr>
       <w:r>
         <w:drawing>
           <wp:inline distT="0" distB="0" distL="0" distR="0">
-            <wp:extent cx="2943225" cy="2219325"/>
+            <wp:extent cx="2943225" cy="2667000"/>
             <wp:effectExtent t="0" r="0" b="0" l="0"/>
             <wp:docPr id="1" name="" descr="" title=""/>
             <wp:cNvGraphicFramePr>
@@ -1120,7 +1120,7 @@
                   <pic:spPr bwMode="auto">
                     <a:xfrm>
                       <a:off x="0" y="0"/>
-                      <a:ext cx="2943225" cy="2219325"/>
+                      <a:ext cx="2943225" cy="2667000"/>
                     </a:xfrm>
                     <a:prstGeom prst="rect">
                       <a:avLst/>
@@ -1135,7 +1135,7 @@
     </w:p>
     <w:p>
       <w:pPr>
-        <w:spacing w:after="60" w:before="0" w:line="200"/>
+        <w:spacing w:after="140" w:before="0" w:line="200"/>
         <w:jc w:val="both"/>
       </w:pPr>
       <w:r>
@@ -3315,13 +3315,13 @@
     <w:p>
       <w:pPr>
         <w:keepNext/>
-        <w:spacing w:after="10" w:before="40"/>
+        <w:spacing w:after="40" w:before="120"/>
         <w:jc w:val="center"/>
       </w:pPr>
       <w:r>
         <w:drawing>
           <wp:inline distT="0" distB="0" distL="0" distR="0">
-            <wp:extent cx="2943225" cy="2352675"/>
+            <wp:extent cx="2943225" cy="3171825"/>
             <wp:effectExtent t="0" r="0" b="0" l="0"/>
             <wp:docPr id="1" name="" descr="" title=""/>
             <wp:cNvGraphicFramePr>
@@ -3346,7 +3346,7 @@
                   <pic:spPr bwMode="auto">
                     <a:xfrm>
                       <a:off x="0" y="0"/>
-                      <a:ext cx="2943225" cy="2352675"/>
+                      <a:ext cx="2943225" cy="3171825"/>
                     </a:xfrm>
                     <a:prstGeom prst="rect">
                       <a:avLst/>
@@ -3361,7 +3361,7 @@
     </w:p>
     <w:p>
       <w:pPr>
-        <w:spacing w:after="60" w:before="0" w:line="200"/>
+        <w:spacing w:after="140" w:before="0" w:line="200"/>
         <w:jc w:val="both"/>
       </w:pPr>
       <w:r>
@@ -3388,13 +3388,13 @@
     <w:p>
       <w:pPr>
         <w:keepNext/>
-        <w:spacing w:after="10" w:before="40"/>
+        <w:spacing w:after="40" w:before="120"/>
         <w:jc w:val="center"/>
       </w:pPr>
       <w:r>
         <w:drawing>
           <wp:inline distT="0" distB="0" distL="0" distR="0">
-            <wp:extent cx="1809750" cy="1209675"/>
+            <wp:extent cx="2943225" cy="1581150"/>
             <wp:effectExtent t="0" r="0" b="0" l="0"/>
             <wp:docPr id="1" name="" descr="" title=""/>
             <wp:cNvGraphicFramePr>
@@ -3419,7 +3419,7 @@
                   <pic:spPr bwMode="auto">
                     <a:xfrm>
                       <a:off x="0" y="0"/>
-                      <a:ext cx="1809750" cy="1209675"/>
+                      <a:ext cx="2943225" cy="1581150"/>
                     </a:xfrm>
                     <a:prstGeom prst="rect">
                       <a:avLst/>
@@ -3434,7 +3434,7 @@
     </w:p>
     <w:p>
       <w:pPr>
-        <w:spacing w:after="60" w:before="0" w:line="200"/>
+        <w:spacing w:after="140" w:before="0" w:line="200"/>
         <w:jc w:val="both"/>
       </w:pPr>
       <w:r>
@@ -3494,13 +3494,13 @@
     <w:p>
       <w:pPr>
         <w:keepNext/>
-        <w:spacing w:after="10" w:before="40"/>
+        <w:spacing w:after="40" w:before="120"/>
         <w:jc w:val="center"/>
       </w:pPr>
       <w:r>
         <w:drawing>
           <wp:inline distT="0" distB="0" distL="0" distR="0">
-            <wp:extent cx="2943225" cy="1362075"/>
+            <wp:extent cx="2943225" cy="1809750"/>
             <wp:effectExtent t="0" r="0" b="0" l="0"/>
             <wp:docPr id="1" name="" descr="" title=""/>
             <wp:cNvGraphicFramePr>
@@ -3525,7 +3525,7 @@
                   <pic:spPr bwMode="auto">
                     <a:xfrm>
                       <a:off x="0" y="0"/>
-                      <a:ext cx="2943225" cy="1362075"/>
+                      <a:ext cx="2943225" cy="1809750"/>
                     </a:xfrm>
                     <a:prstGeom prst="rect">
                       <a:avLst/>
@@ -3540,7 +3540,7 @@
     </w:p>
     <w:p>
       <w:pPr>
-        <w:spacing w:after="60" w:before="0" w:line="200"/>
+        <w:spacing w:after="140" w:before="0" w:line="200"/>
         <w:jc w:val="both"/>
       </w:pPr>
       <w:r>
@@ -3567,13 +3567,13 @@
     <w:p>
       <w:pPr>
         <w:keepNext/>
-        <w:spacing w:after="10" w:before="40"/>
+        <w:spacing w:after="40" w:before="120"/>
         <w:jc w:val="center"/>
       </w:pPr>
       <w:r>
         <w:drawing>
           <wp:inline distT="0" distB="0" distL="0" distR="0">
-            <wp:extent cx="1809750" cy="1209675"/>
+            <wp:extent cx="2943225" cy="1447800"/>
             <wp:effectExtent t="0" r="0" b="0" l="0"/>
             <wp:docPr id="1" name="" descr="" title=""/>
             <wp:cNvGraphicFramePr>
@@ -3598,7 +3598,7 @@
                   <pic:spPr bwMode="auto">
                     <a:xfrm>
                       <a:off x="0" y="0"/>
-                      <a:ext cx="1809750" cy="1209675"/>
+                      <a:ext cx="2943225" cy="1447800"/>
                     </a:xfrm>
                     <a:prstGeom prst="rect">
                       <a:avLst/>
@@ -3613,7 +3613,7 @@
     </w:p>
     <w:p>
       <w:pPr>
-        <w:spacing w:after="60" w:before="0" w:line="200"/>
+        <w:spacing w:after="140" w:before="0" w:line="200"/>
         <w:jc w:val="both"/>
       </w:pPr>
       <w:r>
@@ -5460,13 +5460,13 @@
     <w:p>
       <w:pPr>
         <w:keepNext/>
-        <w:spacing w:after="10" w:before="40"/>
+        <w:spacing w:after="40" w:before="120"/>
         <w:jc w:val="center"/>
       </w:pPr>
       <w:r>
         <w:drawing>
           <wp:inline distT="0" distB="0" distL="0" distR="0">
-            <wp:extent cx="2943225" cy="1400175"/>
+            <wp:extent cx="2943225" cy="1905000"/>
             <wp:effectExtent t="0" r="0" b="0" l="0"/>
             <wp:docPr id="1" name="" descr="" title=""/>
             <wp:cNvGraphicFramePr>
@@ -5491,7 +5491,7 @@
                   <pic:spPr bwMode="auto">
                     <a:xfrm>
                       <a:off x="0" y="0"/>
-                      <a:ext cx="2943225" cy="1400175"/>
+                      <a:ext cx="2943225" cy="1905000"/>
                     </a:xfrm>
                     <a:prstGeom prst="rect">
                       <a:avLst/>
@@ -5506,7 +5506,7 @@
     </w:p>
     <w:p>
       <w:pPr>
-        <w:spacing w:after="60" w:before="0" w:line="200"/>
+        <w:spacing w:after="140" w:before="0" w:line="200"/>
         <w:jc w:val="both"/>
       </w:pPr>
       <w:r>
@@ -6216,13 +6216,13 @@
     <w:p>
       <w:pPr>
         <w:keepNext/>
-        <w:spacing w:after="10" w:before="40"/>
+        <w:spacing w:after="40" w:before="120"/>
         <w:jc w:val="center"/>
       </w:pPr>
       <w:r>
         <w:drawing>
           <wp:inline distT="0" distB="0" distL="0" distR="0">
-            <wp:extent cx="2266950" cy="1266825"/>
+            <wp:extent cx="2943225" cy="1676400"/>
             <wp:effectExtent t="0" r="0" b="0" l="0"/>
             <wp:docPr id="1" name="" descr="" title=""/>
             <wp:cNvGraphicFramePr>
@@ -6247,7 +6247,7 @@
                   <pic:spPr bwMode="auto">
                     <a:xfrm>
                       <a:off x="0" y="0"/>
-                      <a:ext cx="2266950" cy="1266825"/>
+                      <a:ext cx="2943225" cy="1676400"/>
                     </a:xfrm>
                     <a:prstGeom prst="rect">
                       <a:avLst/>
@@ -6262,7 +6262,7 @@
     </w:p>
     <w:p>
       <w:pPr>
-        <w:spacing w:after="60" w:before="0" w:line="200"/>
+        <w:spacing w:after="140" w:before="0" w:line="200"/>
         <w:jc w:val="both"/>
       </w:pPr>
       <w:r>
@@ -8682,13 +8682,13 @@
     <w:p>
       <w:pPr>
         <w:keepNext/>
-        <w:spacing w:after="10" w:before="40"/>
+        <w:spacing w:after="40" w:before="120"/>
         <w:jc w:val="center"/>
       </w:pPr>
       <w:r>
         <w:drawing>
           <wp:inline distT="0" distB="0" distL="0" distR="0">
-            <wp:extent cx="2943225" cy="1314450"/>
+            <wp:extent cx="2943225" cy="1676400"/>
             <wp:effectExtent t="0" r="0" b="0" l="0"/>
             <wp:docPr id="1" name="" descr="" title=""/>
             <wp:cNvGraphicFramePr>
@@ -8713,7 +8713,7 @@
                   <pic:spPr bwMode="auto">
                     <a:xfrm>
                       <a:off x="0" y="0"/>
-                      <a:ext cx="2943225" cy="1314450"/>
+                      <a:ext cx="2943225" cy="1676400"/>
                     </a:xfrm>
                     <a:prstGeom prst="rect">
                       <a:avLst/>
@@ -8728,7 +8728,7 @@
     </w:p>
     <w:p>
       <w:pPr>
-        <w:spacing w:after="60" w:before="0" w:line="200"/>
+        <w:spacing w:after="140" w:before="0" w:line="200"/>
         <w:jc w:val="both"/>
       </w:pPr>
       <w:r>
@@ -8788,13 +8788,13 @@
     <w:p>
       <w:pPr>
         <w:keepNext/>
-        <w:spacing w:after="10" w:before="40"/>
+        <w:spacing w:after="40" w:before="120"/>
         <w:jc w:val="center"/>
       </w:pPr>
       <w:r>
         <w:drawing>
           <wp:inline distT="0" distB="0" distL="0" distR="0">
-            <wp:extent cx="1905000" cy="1571625"/>
+            <wp:extent cx="2943225" cy="2419350"/>
             <wp:effectExtent t="0" r="0" b="0" l="0"/>
             <wp:docPr id="1" name="" descr="" title=""/>
             <wp:cNvGraphicFramePr>
@@ -8819,7 +8819,7 @@
                   <pic:spPr bwMode="auto">
                     <a:xfrm>
                       <a:off x="0" y="0"/>
-                      <a:ext cx="1905000" cy="1571625"/>
+                      <a:ext cx="2943225" cy="2419350"/>
                     </a:xfrm>
                     <a:prstGeom prst="rect">
                       <a:avLst/>
@@ -8834,7 +8834,7 @@
     </w:p>
     <w:p>
       <w:pPr>
-        <w:spacing w:after="60" w:before="0" w:line="200"/>
+        <w:spacing w:after="140" w:before="0" w:line="200"/>
         <w:jc w:val="both"/>
       </w:pPr>
       <w:r>
@@ -8859,13 +8859,13 @@
     <w:p>
       <w:pPr>
         <w:keepNext/>
-        <w:spacing w:after="10" w:before="40"/>
+        <w:spacing w:after="40" w:before="120"/>
         <w:jc w:val="center"/>
       </w:pPr>
       <w:r>
         <w:drawing>
           <wp:inline distT="0" distB="0" distL="0" distR="0">
-            <wp:extent cx="2219325" cy="1238250"/>
+            <wp:extent cx="2943225" cy="1628775"/>
             <wp:effectExtent t="0" r="0" b="0" l="0"/>
             <wp:docPr id="1" name="" descr="" title=""/>
             <wp:cNvGraphicFramePr>
@@ -8890,7 +8890,7 @@
                   <pic:spPr bwMode="auto">
                     <a:xfrm>
                       <a:off x="0" y="0"/>
-                      <a:ext cx="2219325" cy="1238250"/>
+                      <a:ext cx="2943225" cy="1628775"/>
                     </a:xfrm>
                     <a:prstGeom prst="rect">
                       <a:avLst/>
@@ -8905,7 +8905,7 @@
     </w:p>
     <w:p>
       <w:pPr>
-        <w:spacing w:after="60" w:before="0" w:line="200"/>
+        <w:spacing w:after="140" w:before="0" w:line="200"/>
         <w:jc w:val="both"/>
       </w:pPr>
       <w:r>

</xml_diff>

<commit_message>
HW3 v4: keep HW1 text verbatim with changes in blue, add expectation-vs-result table, reorder figures to remove column gaps
Co-Authored-By: Claude Fable 5.1 <noreply@anthropic.com>
Claude-Session: https://claude.ai/code/session_01QFP6ssei1RRu2jM5wMNLRo
</commit_message>
<xml_diff>
--- a/report/HW3_54.docx
+++ b/report/HW3_54.docx
@@ -115,7 +115,7 @@
           <w:sz w:val="20"/>
           <w:szCs w:val="20"/>
         </w:rPr>
-        <w:t xml:space="preserve">Docks near a university empty within minutes of a class ending. Because the timetable makes this surge predictable, we cast rebalancing as an AI decision problem: one truck moves bikes before the bell instead of after the stockout. We (i) reconstruct censored demand and the operator’s actual truck moves from public trip records and inventory snapshots, (ii) learn a schedule-aware, calibrated predictor of P(stockout within h min) per station, and (iii) plan truck routes that minimize expected unmet rentals plus travel cost. </w:t>
+        <w:t xml:space="preserve">Docks near a university empty within minutes of a class ending. Because the timetable makes this surge predictable, we cast rebalancing as an AI decision problem: one truck moves bikes before the bell instead of after the stockout. We (i) reconstruct censored demand and the operator’s actual truck moves from public trip records and inventory snapshots, (ii) learn a schedule-aware, calibrated predictor of P(stockout within h min) per station, and (iii) plan truck routes by rolling-horizon search that minimizes expected unmet rentals plus travel cost. </w:t>
       </w:r>
       <w:r>
         <w:rPr>
@@ -1161,7 +1161,7 @@
           <w:sz w:val="20"/>
           <w:szCs w:val="20"/>
         </w:rPr>
-        <w:t xml:space="preserve">Static repositioning is a routing-and-inventory problem [4]; dynamic repositioning combines forecasts with heuristics or mixed-integer programs [5, 6]; recent work uses spatio-temporal reinforcement learning [7]. Two ingredients matter on a campus yet are rarely combined: censored-demand estimation by simulation [8] or censored Gaussian processes [9], and inferring the operator’s unpublished truck moves by subtracting trip flows from inventory changes [10]. A 2025 NTU thesis optimized dispatch near NTU with survival-model demand on one month of trips [11]. No published work, to our knowledge, (a) uses the class timetable as an explicit signal, (b) outputs calibrated stockout probabilities rather than point forecasts, or (c) tests transfer between campuses; NSYSU has never been studied and Kaohsiung publishes no trip data, so transfer is the practical question. </w:t>
+        <w:t xml:space="preserve">Static repositioning is a routing-and-inventory problem [4]; dynamic repositioning combines forecasts with heuristics or mixed-integer programs [5, 6]; recent work uses spatio-temporal reinforcement learning [7]. Two ingredients matter on a campus yet are rarely combined: censored-demand estimation by simulation [8] or censored Gaussian processes [9], and inferring the operator’s unpublished truck moves by subtracting trip flows from inventory changes [10]; on Taipei data this reveals 18–20 thousand unexplained bike moves on 12 Mar 2025, peaking at 07–09 and 18–20. A 2025 NTU thesis optimized dispatch near NTU with survival-model demand on one month of trips [11]. No published work, to our knowledge, (a) uses the class timetable as an explicit signal, (b) outputs calibrated stockout probabilities rather than point forecasts, or (c) tests transfer between campuses; NSYSU has never been studied and Kaohsiung publishes no trip data, so transfer is the practical question. </w:t>
       </w:r>
       <w:r>
         <w:rPr>
@@ -1201,7 +1201,24 @@
           <w:sz w:val="20"/>
           <w:szCs w:val="20"/>
         </w:rPr>
-        <w:t xml:space="preserve">Fig. 2 shows the pipeline. Open NTU data (hourly trips [1]; 10-minute inventory [2]) serve to reconstruct demand and operator moves, to train a schedule-aware gradient-boosting predictor with reliability checks, and to drive a rolling-horizon route planner; policies are compared in a replay simulator fed with real trips. The predictor is then ported to NSYSU with locally logged inventory [12] for a live web demo. Contributions: (1) an uncertainty-aware pre-emptive rebalancing method reproducible from open data; (2) the first quantification of class-end stockouts at NTU and NSYSU; (3) an NTU→NSYSU transfer study. </w:t>
+        <w:t xml:space="preserve">Fig. 2 shows the pipeline. Open NTU data (hourly trips [1]; 10-minute inventory over 416 days [2]) serve to reconstruct demand and operator moves, to train a schedule-aware gradient-boosting predictor with reliability checks, and to drive a rolling-horizon route planner; policies are compared in a replay simulator fed with real trips. The predictor is then ported to NSYSU with a few weeks of locally logged inventory [12] for a live web demo that recommends a pre-bell truck plan (</w:t>
+      </w:r>
+      <w:r>
+        <w:rPr>
+          <w:rFonts w:ascii="Times New Roman" w:cs="Times New Roman" w:eastAsia="PMingLiU" w:hAnsi="Times New Roman"/>
+          <w:color w:val="0000FF"/>
+          <w:sz w:val="20"/>
+          <w:szCs w:val="20"/>
+        </w:rPr>
+        <w:t xml:space="preserve">Fig. 12</w:t>
+      </w:r>
+      <w:r>
+        <w:rPr>
+          <w:rFonts w:ascii="Times New Roman" w:cs="Times New Roman" w:eastAsia="PMingLiU" w:hAnsi="Times New Roman"/>
+          <w:sz w:val="20"/>
+          <w:szCs w:val="20"/>
+        </w:rPr>
+        <w:t xml:space="preserve">). Contributions: (1) an uncertainty-aware pre-emptive rebalancing method reproducible from open data; (2) the first quantification of class-end stockouts at NTU and NSYSU; (3) an NTU→NSYSU transfer study. </w:t>
       </w:r>
       <w:r>
         <w:rPr>
@@ -1336,6 +1353,238 @@
     <w:p>
       <w:pPr>
         <w:keepNext/>
+        <w:spacing w:after="30" w:before="90" w:line="240"/>
+      </w:pPr>
+      <w:r>
+        <w:rPr>
+          <w:rFonts w:ascii="Times New Roman" w:cs="Times New Roman" w:eastAsia="PMingLiU" w:hAnsi="Times New Roman"/>
+          <w:b/>
+          <w:bCs/>
+          <w:color w:val="0000FF"/>
+          <w:sz w:val="22"/>
+          <w:szCs w:val="22"/>
+        </w:rPr>
+        <w:t xml:space="preserve">2.2. Data acquisition and panel construction</w:t>
+      </w:r>
+    </w:p>
+    <w:p>
+      <w:pPr>
+        <w:keepNext/>
+        <w:spacing w:after="20" w:before="60" w:line="240"/>
+      </w:pPr>
+      <w:r>
+        <w:rPr>
+          <w:rFonts w:ascii="Times New Roman" w:cs="Times New Roman" w:eastAsia="PMingLiU" w:hAnsi="Times New Roman"/>
+          <w:b/>
+          <w:bCs/>
+          <w:i/>
+          <w:iCs/>
+          <w:color w:val="0000FF"/>
+          <w:sz w:val="20"/>
+          <w:szCs w:val="20"/>
+        </w:rPr>
+        <w:t xml:space="preserve">2.2.1. NSYSU inventory logger (logger/fetch_youbike.py)</w:t>
+      </w:r>
+    </w:p>
+    <w:p>
+      <w:pPr>
+        <w:spacing w:after="0" w:line="240"/>
+        <w:ind w:firstLine="288"/>
+        <w:jc w:val="both"/>
+      </w:pPr>
+      <w:r>
+        <w:rPr>
+          <w:rFonts w:ascii="Times New Roman" w:cs="Times New Roman" w:eastAsia="PMingLiU" w:hAnsi="Times New Roman"/>
+          <w:color w:val="0000FF"/>
+          <w:sz w:val="20"/>
+          <w:szCs w:val="20"/>
+        </w:rPr>
+        <w:t xml:space="preserve">YouBike publishes a JSON of every station (bikes, free docks, status, update time) but no history. Our logger runs in GitHub Actions and commits one CSV row per station and 10-minute slot:</w:t>
+      </w:r>
+    </w:p>
+    <w:p>
+      <w:pPr>
+        <w:spacing w:after="0" w:line="240"/>
+        <w:ind w:left="300" w:hanging="180"/>
+        <w:jc w:val="both"/>
+      </w:pPr>
+      <w:r>
+        <w:rPr>
+          <w:rFonts w:ascii="Times New Roman" w:cs="Times New Roman" w:eastAsia="PMingLiU" w:hAnsi="Times New Roman"/>
+          <w:color w:val="0000FF"/>
+          <w:sz w:val="20"/>
+          <w:szCs w:val="20"/>
+        </w:rPr>
+        <w:t xml:space="preserve">– </w:t>
+      </w:r>
+      <w:r>
+        <w:rPr>
+          <w:rFonts w:ascii="Times New Roman" w:cs="Times New Roman" w:eastAsia="PMingLiU" w:hAnsi="Times New Roman"/>
+          <w:color w:val="0000FF"/>
+          <w:sz w:val="20"/>
+          <w:szCs w:val="20"/>
+        </w:rPr>
+        <w:t xml:space="preserve">Scope: the 309 stations within 5 km of NSYSU (area code 12); the eight on-campus stations and eleven gateway stations between campus and the KRT are tagged for analysis.</w:t>
+      </w:r>
+    </w:p>
+    <w:p>
+      <w:pPr>
+        <w:spacing w:after="0" w:line="240"/>
+        <w:ind w:left="300" w:hanging="180"/>
+        <w:jc w:val="both"/>
+      </w:pPr>
+      <w:r>
+        <w:rPr>
+          <w:rFonts w:ascii="Times New Roman" w:cs="Times New Roman" w:eastAsia="PMingLiU" w:hAnsi="Times New Roman"/>
+          <w:color w:val="0000FF"/>
+          <w:sz w:val="20"/>
+          <w:szCs w:val="20"/>
+        </w:rPr>
+        <w:t xml:space="preserve">– </w:t>
+      </w:r>
+      <w:r>
+        <w:rPr>
+          <w:rFonts w:ascii="Times New Roman" w:cs="Times New Roman" w:eastAsia="PMingLiU" w:hAnsi="Times New Roman"/>
+          <w:color w:val="0000FF"/>
+          <w:sz w:val="20"/>
+          <w:szCs w:val="20"/>
+        </w:rPr>
+        <w:t xml:space="preserve">Reliability: GitHub throttles scheduled jobs in quiet repositories (4 runs on our first day), so one run logs for 340 minutes and dispatches its successor before it ends; an hourly cron only restarts a broken chain, and a guard script keeps a single run active.</w:t>
+      </w:r>
+    </w:p>
+    <w:p>
+      <w:pPr>
+        <w:spacing w:after="40" w:line="240"/>
+        <w:ind w:left="300" w:hanging="180"/>
+        <w:jc w:val="both"/>
+      </w:pPr>
+      <w:r>
+        <w:rPr>
+          <w:rFonts w:ascii="Times New Roman" w:cs="Times New Roman" w:eastAsia="PMingLiU" w:hAnsi="Times New Roman"/>
+          <w:color w:val="0000FF"/>
+          <w:sz w:val="20"/>
+          <w:szCs w:val="20"/>
+        </w:rPr>
+        <w:t xml:space="preserve">– </w:t>
+      </w:r>
+      <w:r>
+        <w:rPr>
+          <w:rFonts w:ascii="Times New Roman" w:cs="Times New Roman" w:eastAsia="PMingLiU" w:hAnsi="Times New Roman"/>
+          <w:color w:val="0000FF"/>
+          <w:sz w:val="20"/>
+          <w:szCs w:val="20"/>
+        </w:rPr>
+        <w:t xml:space="preserve">Output: 144 snapshots per day since 2 Oct (one 6-hour gap on 12 Oct); station status 2 (out of service) is stored so that an offline station is never counted as a stockout.</w:t>
+      </w:r>
+    </w:p>
+    <w:p>
+      <w:pPr>
+        <w:keepNext/>
+        <w:spacing w:after="20" w:before="60" w:line="240"/>
+      </w:pPr>
+      <w:r>
+        <w:rPr>
+          <w:rFonts w:ascii="Times New Roman" w:cs="Times New Roman" w:eastAsia="PMingLiU" w:hAnsi="Times New Roman"/>
+          <w:b/>
+          <w:bCs/>
+          <w:i/>
+          <w:iCs/>
+          <w:color w:val="0000FF"/>
+          <w:sz w:val="20"/>
+          <w:szCs w:val="20"/>
+        </w:rPr>
+        <w:t xml:space="preserve">2.2.2. NTU trip flows (ntu_pipeline.py trips)</w:t>
+      </w:r>
+    </w:p>
+    <w:p>
+      <w:pPr>
+        <w:spacing w:after="0" w:line="240"/>
+        <w:ind w:firstLine="288"/>
+        <w:jc w:val="both"/>
+      </w:pPr>
+      <w:r>
+        <w:rPr>
+          <w:rFonts w:ascii="Times New Roman" w:cs="Times New Roman" w:eastAsia="PMingLiU" w:hAnsi="Times New Roman"/>
+          <w:color w:val="0000FF"/>
+          <w:sz w:val="20"/>
+          <w:szCs w:val="20"/>
+        </w:rPr>
+        <w:t xml:space="preserve">The Taipei trip records [1] give rent time, rent station, return time, return station and duration for every ride, with times truncated to the hour and stations given by name. Each monthly zip (6–7 M rows) is streamed in chunks; rides with either end among the study stations are kept; names are matched to station ids through the station table of [2]; rentals and returns are summed per station and hour. Ten months (Sep 2024–Jun 2025) give 10.2 M rides in the study area and take 15 s per month.</w:t>
+      </w:r>
+    </w:p>
+    <w:p>
+      <w:pPr>
+        <w:keepNext/>
+        <w:spacing w:after="20" w:before="60" w:line="240"/>
+      </w:pPr>
+      <w:r>
+        <w:rPr>
+          <w:rFonts w:ascii="Times New Roman" w:cs="Times New Roman" w:eastAsia="PMingLiU" w:hAnsi="Times New Roman"/>
+          <w:b/>
+          <w:bCs/>
+          <w:i/>
+          <w:iCs/>
+          <w:color w:val="0000FF"/>
+          <w:sz w:val="20"/>
+          <w:szCs w:val="20"/>
+        </w:rPr>
+        <w:t xml:space="preserve">2.2.3. NTU inventory panel (ntu_pipeline.py snapshots)</w:t>
+      </w:r>
+    </w:p>
+    <w:p>
+      <w:pPr>
+        <w:spacing w:after="0" w:line="240"/>
+        <w:ind w:firstLine="288"/>
+        <w:jc w:val="both"/>
+      </w:pPr>
+      <w:r>
+        <w:rPr>
+          <w:rFonts w:ascii="Times New Roman" w:cs="Times New Roman" w:eastAsia="PMingLiU" w:hAnsi="Times New Roman"/>
+          <w:color w:val="0000FF"/>
+          <w:sz w:val="20"/>
+          <w:szCs w:val="20"/>
+        </w:rPr>
+        <w:t xml:space="preserve">The snapshot repository [2] stores one row per station update (about 95 per station per day). Stations report only when something changes, so a quiet night produces no rows while a daytime silence of hours means the station is offline. We forward-fill onto a 10-minute grid and mark a value unknown when the last report is older than 120 min during 07:00–23:00 or 600 min otherwise, giving 6.1 M station-slots with 7.9% unknown, concentrated in a collection outage on 1–16 Oct 2024.</w:t>
+      </w:r>
+    </w:p>
+    <w:p>
+      <w:pPr>
+        <w:keepNext/>
+        <w:spacing w:after="20" w:before="60" w:line="240"/>
+      </w:pPr>
+      <w:r>
+        <w:rPr>
+          <w:rFonts w:ascii="Times New Roman" w:cs="Times New Roman" w:eastAsia="PMingLiU" w:hAnsi="Times New Roman"/>
+          <w:b/>
+          <w:bCs/>
+          <w:i/>
+          <w:iCs/>
+          <w:color w:val="0000FF"/>
+          <w:sz w:val="20"/>
+          <w:szCs w:val="20"/>
+        </w:rPr>
+        <w:t xml:space="preserve">2.2.4. Study area and calendars</w:t>
+      </w:r>
+    </w:p>
+    <w:p>
+      <w:pPr>
+        <w:spacing w:after="0" w:line="240"/>
+        <w:ind w:firstLine="288"/>
+        <w:jc w:val="both"/>
+      </w:pPr>
+      <w:r>
+        <w:rPr>
+          <w:rFonts w:ascii="Times New Roman" w:cs="Times New Roman" w:eastAsia="PMingLiU" w:hAnsi="Times New Roman"/>
+          <w:color w:val="0000FF"/>
+          <w:sz w:val="20"/>
+          <w:szCs w:val="20"/>
+        </w:rPr>
+        <w:t xml:space="preserve">The NTU study area is the 144 stations within 1.2 km of the campus centroid (59 on campus, 85 in the surrounding ring). Bell times are the period ends of each campus (NTU: 09:00, 10:00, 11:10, 12:10, 13:10, 14:10, 15:10, 16:20, 17:20, 18:20, 19:15, 20:10; NSYSU: on the hour from 10:00 to 18:00, then 19:10, 20:10, 21:10). Taiwanese public holidays and the semester calendars (NTU: 2 Sep 2024–10 Jan 2025 and 17 Feb–13 Jun 2025; NSYSU: from 7 Sep 2026) define the off-day and semester-week features.</w:t>
+      </w:r>
+    </w:p>
+    <w:p>
+      <w:pPr>
+        <w:keepNext/>
         <w:spacing w:after="40" w:before="120"/>
         <w:jc w:val="center"/>
       </w:pPr>
@@ -1416,30 +1665,10 @@
           <w:rFonts w:ascii="Times New Roman" w:cs="Times New Roman" w:eastAsia="PMingLiU" w:hAnsi="Times New Roman"/>
           <w:b/>
           <w:bCs/>
-          <w:color w:val="0000FF"/>
           <w:sz w:val="22"/>
           <w:szCs w:val="22"/>
         </w:rPr>
-        <w:t xml:space="preserve">2.2. Data acquisition and panel construction</w:t>
-      </w:r>
-    </w:p>
-    <w:p>
-      <w:pPr>
-        <w:keepNext/>
-        <w:spacing w:after="20" w:before="60" w:line="240"/>
-      </w:pPr>
-      <w:r>
-        <w:rPr>
-          <w:rFonts w:ascii="Times New Roman" w:cs="Times New Roman" w:eastAsia="PMingLiU" w:hAnsi="Times New Roman"/>
-          <w:b/>
-          <w:bCs/>
-          <w:i/>
-          <w:iCs/>
-          <w:color w:val="0000FF"/>
-          <w:sz w:val="20"/>
-          <w:szCs w:val="20"/>
-        </w:rPr>
-        <w:t xml:space="preserve">2.2.1. NSYSU inventory logger (logger/fetch_youbike.py)</w:t>
+        <w:t xml:space="preserve">2.3. Demand reconstruction and operator inference</w:t>
       </w:r>
     </w:p>
     <w:p>
@@ -1451,105 +1680,243 @@
       <w:r>
         <w:rPr>
           <w:rFonts w:ascii="Times New Roman" w:cs="Times New Roman" w:eastAsia="PMingLiU" w:hAnsi="Times New Roman"/>
-          <w:color w:val="0000FF"/>
-          <w:sz w:val="20"/>
-          <w:szCs w:val="20"/>
-        </w:rPr>
-        <w:t xml:space="preserve">YouBike publishes a JSON of every station (bikes, free docks, status, update time) but no history. Our logger runs in GitHub Actions and commits one CSV row per station and 10-minute slot:</w:t>
-      </w:r>
-    </w:p>
-    <w:p>
-      <w:pPr>
-        <w:spacing w:after="0" w:line="240"/>
-        <w:ind w:left="300" w:hanging="180"/>
-        <w:jc w:val="both"/>
-      </w:pPr>
-      <w:r>
-        <w:rPr>
-          <w:rFonts w:ascii="Times New Roman" w:cs="Times New Roman" w:eastAsia="PMingLiU" w:hAnsi="Times New Roman"/>
-          <w:color w:val="0000FF"/>
-          <w:sz w:val="20"/>
-          <w:szCs w:val="20"/>
-        </w:rPr>
-        <w:t xml:space="preserve">– </w:t>
-      </w:r>
-      <w:r>
-        <w:rPr>
-          <w:rFonts w:ascii="Times New Roman" w:cs="Times New Roman" w:eastAsia="PMingLiU" w:hAnsi="Times New Roman"/>
-          <w:color w:val="0000FF"/>
-          <w:sz w:val="20"/>
-          <w:szCs w:val="20"/>
-        </w:rPr>
-        <w:t xml:space="preserve">Scope: the 309 stations within 5 km of NSYSU (area code 12); the eight on-campus stations and eleven gateway stations between campus and the KRT are tagged for analysis.</w:t>
-      </w:r>
-    </w:p>
-    <w:p>
-      <w:pPr>
-        <w:spacing w:after="0" w:line="240"/>
-        <w:ind w:left="300" w:hanging="180"/>
-        <w:jc w:val="both"/>
-      </w:pPr>
-      <w:r>
-        <w:rPr>
-          <w:rFonts w:ascii="Times New Roman" w:cs="Times New Roman" w:eastAsia="PMingLiU" w:hAnsi="Times New Roman"/>
-          <w:color w:val="0000FF"/>
-          <w:sz w:val="20"/>
-          <w:szCs w:val="20"/>
-        </w:rPr>
-        <w:t xml:space="preserve">– </w:t>
-      </w:r>
-      <w:r>
-        <w:rPr>
-          <w:rFonts w:ascii="Times New Roman" w:cs="Times New Roman" w:eastAsia="PMingLiU" w:hAnsi="Times New Roman"/>
-          <w:color w:val="0000FF"/>
-          <w:sz w:val="20"/>
-          <w:szCs w:val="20"/>
-        </w:rPr>
-        <w:t xml:space="preserve">Reliability: GitHub throttles scheduled jobs in quiet repositories (4 runs on our first day), so one run logs for 340 minutes and dispatches its successor before it ends; an hourly cron only restarts a broken chain, and a guard script keeps a single run active.</w:t>
-      </w:r>
-    </w:p>
-    <w:p>
-      <w:pPr>
-        <w:spacing w:after="40" w:line="240"/>
-        <w:ind w:left="300" w:hanging="180"/>
-        <w:jc w:val="both"/>
-      </w:pPr>
-      <w:r>
-        <w:rPr>
-          <w:rFonts w:ascii="Times New Roman" w:cs="Times New Roman" w:eastAsia="PMingLiU" w:hAnsi="Times New Roman"/>
-          <w:color w:val="0000FF"/>
-          <w:sz w:val="20"/>
-          <w:szCs w:val="20"/>
-        </w:rPr>
-        <w:t xml:space="preserve">– </w:t>
-      </w:r>
-      <w:r>
-        <w:rPr>
-          <w:rFonts w:ascii="Times New Roman" w:cs="Times New Roman" w:eastAsia="PMingLiU" w:hAnsi="Times New Roman"/>
-          <w:color w:val="0000FF"/>
-          <w:sz w:val="20"/>
-          <w:szCs w:val="20"/>
-        </w:rPr>
-        <w:t xml:space="preserve">Output: 144 snapshots per day since 2 Oct (one 6-hour gap on 12 Oct); station status 2 (out of service) is stored so that an offline station is never counted as a stockout.</w:t>
-      </w:r>
-    </w:p>
-    <w:p>
-      <w:pPr>
-        <w:keepNext/>
-        <w:spacing w:after="20" w:before="60" w:line="240"/>
-      </w:pPr>
-      <w:r>
-        <w:rPr>
-          <w:rFonts w:ascii="Times New Roman" w:cs="Times New Roman" w:eastAsia="PMingLiU" w:hAnsi="Times New Roman"/>
-          <w:b/>
-          <w:bCs/>
+          <w:sz w:val="20"/>
+          <w:szCs w:val="20"/>
+        </w:rPr>
+        <w:t xml:space="preserve">Per station-hour, Δ</w:t>
+      </w:r>
+      <w:r>
+        <w:rPr>
+          <w:rFonts w:ascii="Times New Roman" w:cs="Times New Roman" w:eastAsia="PMingLiU" w:hAnsi="Times New Roman"/>
           <w:i/>
           <w:iCs/>
-          <w:color w:val="0000FF"/>
-          <w:sz w:val="20"/>
-          <w:szCs w:val="20"/>
-        </w:rPr>
-        <w:t xml:space="preserve">2.2.2. NTU trip flows (ntu_pipeline.py trips)</w:t>
+          <w:sz w:val="20"/>
+          <w:szCs w:val="20"/>
+        </w:rPr>
+        <w:t xml:space="preserve">s</w:t>
+      </w:r>
+      <w:r>
+        <w:rPr>
+          <w:rFonts w:ascii="Times New Roman" w:cs="Times New Roman" w:eastAsia="PMingLiU" w:hAnsi="Times New Roman"/>
+          <w:sz w:val="20"/>
+          <w:szCs w:val="20"/>
+          <w:vertAlign w:val="subscript"/>
+        </w:rPr>
+        <w:t xml:space="preserve">i</w:t>
+      </w:r>
+      <w:r>
+        <w:rPr>
+          <w:rFonts w:ascii="Times New Roman" w:cs="Times New Roman" w:eastAsia="PMingLiU" w:hAnsi="Times New Roman"/>
+          <w:sz w:val="20"/>
+          <w:szCs w:val="20"/>
+        </w:rPr>
+        <w:t xml:space="preserve"> = </w:t>
+      </w:r>
+      <w:r>
+        <w:rPr>
+          <w:rFonts w:ascii="Times New Roman" w:cs="Times New Roman" w:eastAsia="PMingLiU" w:hAnsi="Times New Roman"/>
+          <w:i/>
+          <w:iCs/>
+          <w:sz w:val="20"/>
+          <w:szCs w:val="20"/>
+        </w:rPr>
+        <w:t xml:space="preserve">q</w:t>
+      </w:r>
+      <w:r>
+        <w:rPr>
+          <w:rFonts w:ascii="Times New Roman" w:cs="Times New Roman" w:eastAsia="PMingLiU" w:hAnsi="Times New Roman"/>
+          <w:sz w:val="20"/>
+          <w:szCs w:val="20"/>
+          <w:vertAlign w:val="subscript"/>
+        </w:rPr>
+        <w:t xml:space="preserve">i</w:t>
+      </w:r>
+      <w:r>
+        <w:rPr>
+          <w:rFonts w:ascii="Times New Roman" w:cs="Times New Roman" w:eastAsia="PMingLiU" w:hAnsi="Times New Roman"/>
+          <w:sz w:val="20"/>
+          <w:szCs w:val="20"/>
+        </w:rPr>
+        <w:t xml:space="preserve"> − </w:t>
+      </w:r>
+      <w:r>
+        <w:rPr>
+          <w:rFonts w:ascii="Times New Roman" w:cs="Times New Roman" w:eastAsia="PMingLiU" w:hAnsi="Times New Roman"/>
+          <w:i/>
+          <w:iCs/>
+          <w:sz w:val="20"/>
+          <w:szCs w:val="20"/>
+        </w:rPr>
+        <w:t xml:space="preserve">r</w:t>
+      </w:r>
+      <w:r>
+        <w:rPr>
+          <w:rFonts w:ascii="Times New Roman" w:cs="Times New Roman" w:eastAsia="PMingLiU" w:hAnsi="Times New Roman"/>
+          <w:sz w:val="20"/>
+          <w:szCs w:val="20"/>
+          <w:vertAlign w:val="subscript"/>
+        </w:rPr>
+        <w:t xml:space="preserve">i</w:t>
+      </w:r>
+      <w:r>
+        <w:rPr>
+          <w:rFonts w:ascii="Times New Roman" w:cs="Times New Roman" w:eastAsia="PMingLiU" w:hAnsi="Times New Roman"/>
+          <w:sz w:val="20"/>
+          <w:szCs w:val="20"/>
+        </w:rPr>
+        <w:t xml:space="preserve"> + </w:t>
+      </w:r>
+      <w:r>
+        <w:rPr>
+          <w:rFonts w:ascii="Times New Roman" w:cs="Times New Roman" w:eastAsia="PMingLiU" w:hAnsi="Times New Roman"/>
+          <w:i/>
+          <w:iCs/>
+          <w:sz w:val="20"/>
+          <w:szCs w:val="20"/>
+        </w:rPr>
+        <w:t xml:space="preserve">m</w:t>
+      </w:r>
+      <w:r>
+        <w:rPr>
+          <w:rFonts w:ascii="Times New Roman" w:cs="Times New Roman" w:eastAsia="PMingLiU" w:hAnsi="Times New Roman"/>
+          <w:sz w:val="20"/>
+          <w:szCs w:val="20"/>
+          <w:vertAlign w:val="subscript"/>
+        </w:rPr>
+        <w:t xml:space="preserve">i</w:t>
+      </w:r>
+      <w:r>
+        <w:rPr>
+          <w:rFonts w:ascii="Times New Roman" w:cs="Times New Roman" w:eastAsia="PMingLiU" w:hAnsi="Times New Roman"/>
+          <w:sz w:val="20"/>
+          <w:szCs w:val="20"/>
+        </w:rPr>
+        <w:t xml:space="preserve"> + ε, with </w:t>
+      </w:r>
+      <w:r>
+        <w:rPr>
+          <w:rFonts w:ascii="Times New Roman" w:cs="Times New Roman" w:eastAsia="PMingLiU" w:hAnsi="Times New Roman"/>
+          <w:i/>
+          <w:iCs/>
+          <w:sz w:val="20"/>
+          <w:szCs w:val="20"/>
+        </w:rPr>
+        <w:t xml:space="preserve">m</w:t>
+      </w:r>
+      <w:r>
+        <w:rPr>
+          <w:rFonts w:ascii="Times New Roman" w:cs="Times New Roman" w:eastAsia="PMingLiU" w:hAnsi="Times New Roman"/>
+          <w:sz w:val="20"/>
+          <w:szCs w:val="20"/>
+          <w:vertAlign w:val="subscript"/>
+        </w:rPr>
+        <w:t xml:space="preserve">i</w:t>
+      </w:r>
+      <w:r>
+        <w:rPr>
+          <w:rFonts w:ascii="Times New Roman" w:cs="Times New Roman" w:eastAsia="PMingLiU" w:hAnsi="Times New Roman"/>
+          <w:sz w:val="20"/>
+          <w:szCs w:val="20"/>
+        </w:rPr>
+        <w:t xml:space="preserve"> the operator’s net truck move; residuals |Δ</w:t>
+      </w:r>
+      <w:r>
+        <w:rPr>
+          <w:rFonts w:ascii="Times New Roman" w:cs="Times New Roman" w:eastAsia="PMingLiU" w:hAnsi="Times New Roman"/>
+          <w:i/>
+          <w:iCs/>
+          <w:sz w:val="20"/>
+          <w:szCs w:val="20"/>
+        </w:rPr>
+        <w:t xml:space="preserve">s</w:t>
+      </w:r>
+      <w:r>
+        <w:rPr>
+          <w:rFonts w:ascii="Times New Roman" w:cs="Times New Roman" w:eastAsia="PMingLiU" w:hAnsi="Times New Roman"/>
+          <w:sz w:val="20"/>
+          <w:szCs w:val="20"/>
+        </w:rPr>
+        <w:t xml:space="preserve"> − (</w:t>
+      </w:r>
+      <w:r>
+        <w:rPr>
+          <w:rFonts w:ascii="Times New Roman" w:cs="Times New Roman" w:eastAsia="PMingLiU" w:hAnsi="Times New Roman"/>
+          <w:i/>
+          <w:iCs/>
+          <w:sz w:val="20"/>
+          <w:szCs w:val="20"/>
+        </w:rPr>
+        <w:t xml:space="preserve">q</w:t>
+      </w:r>
+      <w:r>
+        <w:rPr>
+          <w:rFonts w:ascii="Times New Roman" w:cs="Times New Roman" w:eastAsia="PMingLiU" w:hAnsi="Times New Roman"/>
+          <w:sz w:val="20"/>
+          <w:szCs w:val="20"/>
+        </w:rPr>
+        <w:t xml:space="preserve"> − </w:t>
+      </w:r>
+      <w:r>
+        <w:rPr>
+          <w:rFonts w:ascii="Times New Roman" w:cs="Times New Roman" w:eastAsia="PMingLiU" w:hAnsi="Times New Roman"/>
+          <w:i/>
+          <w:iCs/>
+          <w:sz w:val="20"/>
+          <w:szCs w:val="20"/>
+        </w:rPr>
+        <w:t xml:space="preserve">r</w:t>
+      </w:r>
+      <w:r>
+        <w:rPr>
+          <w:rFonts w:ascii="Times New Roman" w:cs="Times New Roman" w:eastAsia="PMingLiU" w:hAnsi="Times New Roman"/>
+          <w:sz w:val="20"/>
+          <w:szCs w:val="20"/>
+        </w:rPr>
+        <w:t xml:space="preserve">)| ≥ 5 over 3-hour windows are labelled as moves [10], giving an observed operator policy. For censoring, minutes with </w:t>
+      </w:r>
+      <w:r>
+        <w:rPr>
+          <w:rFonts w:ascii="Times New Roman" w:cs="Times New Roman" w:eastAsia="PMingLiU" w:hAnsi="Times New Roman"/>
+          <w:i/>
+          <w:iCs/>
+          <w:sz w:val="20"/>
+          <w:szCs w:val="20"/>
+        </w:rPr>
+        <w:t xml:space="preserve">s</w:t>
+      </w:r>
+      <w:r>
+        <w:rPr>
+          <w:rFonts w:ascii="Times New Roman" w:cs="Times New Roman" w:eastAsia="PMingLiU" w:hAnsi="Times New Roman"/>
+          <w:sz w:val="20"/>
+          <w:szCs w:val="20"/>
+          <w:vertAlign w:val="subscript"/>
+        </w:rPr>
+        <w:t xml:space="preserve">i</w:t>
+      </w:r>
+      <w:r>
+        <w:rPr>
+          <w:rFonts w:ascii="Times New Roman" w:cs="Times New Roman" w:eastAsia="PMingLiU" w:hAnsi="Times New Roman"/>
+          <w:sz w:val="20"/>
+          <w:szCs w:val="20"/>
+        </w:rPr>
+        <w:t xml:space="preserve"> = 0 are dropped from the exposure of a Poisson rate model, so λ</w:t>
+      </w:r>
+      <w:r>
+        <w:rPr>
+          <w:rFonts w:ascii="Times New Roman" w:cs="Times New Roman" w:eastAsia="PMingLiU" w:hAnsi="Times New Roman"/>
+          <w:sz w:val="20"/>
+          <w:szCs w:val="20"/>
+          <w:vertAlign w:val="subscript"/>
+        </w:rPr>
+        <w:t xml:space="preserve">r</w:t>
+      </w:r>
+      <w:r>
+        <w:rPr>
+          <w:rFonts w:ascii="Times New Roman" w:cs="Times New Roman" w:eastAsia="PMingLiU" w:hAnsi="Times New Roman"/>
+          <w:sz w:val="20"/>
+          <w:szCs w:val="20"/>
+        </w:rPr>
+        <w:t xml:space="preserve"> reflects only time when a rental was possible [8, 9].</w:t>
       </w:r>
     </w:p>
     <w:p>
@@ -1565,135 +1932,7 @@
           <w:sz w:val="20"/>
           <w:szCs w:val="20"/>
         </w:rPr>
-        <w:t xml:space="preserve">The Taipei trip records [1] give rent time, rent station, return time, return station and duration for every ride, with times truncated to the hour and stations given by name. Each monthly zip (6–7 M rows) is streamed in chunks; rides with either end among the study stations are kept; names are matched to station ids through the station table of [2]; rentals and returns are summed per station and hour. Ten months (Sep 2024–Jun 2025) give 10.2 M rides in the study area and take 15 s per month.</w:t>
-      </w:r>
-    </w:p>
-    <w:p>
-      <w:pPr>
-        <w:keepNext/>
-        <w:spacing w:after="20" w:before="60" w:line="240"/>
-      </w:pPr>
-      <w:r>
-        <w:rPr>
-          <w:rFonts w:ascii="Times New Roman" w:cs="Times New Roman" w:eastAsia="PMingLiU" w:hAnsi="Times New Roman"/>
-          <w:b/>
-          <w:bCs/>
-          <w:i/>
-          <w:iCs/>
-          <w:color w:val="0000FF"/>
-          <w:sz w:val="20"/>
-          <w:szCs w:val="20"/>
-        </w:rPr>
-        <w:t xml:space="preserve">2.2.3. NTU inventory panel (ntu_pipeline.py snapshots)</w:t>
-      </w:r>
-    </w:p>
-    <w:p>
-      <w:pPr>
-        <w:spacing w:after="0" w:line="240"/>
-        <w:ind w:firstLine="288"/>
-        <w:jc w:val="both"/>
-      </w:pPr>
-      <w:r>
-        <w:rPr>
-          <w:rFonts w:ascii="Times New Roman" w:cs="Times New Roman" w:eastAsia="PMingLiU" w:hAnsi="Times New Roman"/>
-          <w:color w:val="0000FF"/>
-          <w:sz w:val="20"/>
-          <w:szCs w:val="20"/>
-        </w:rPr>
-        <w:t xml:space="preserve">The snapshot repository [2] stores one row per station update (about 95 per station per day). Stations report only when something changes, so a quiet night produces no rows while a daytime silence of hours means the station is offline. We forward-fill onto a 10-minute grid and mark a value unknown when the last report is older than 120 min during 07:00–23:00 or 600 min otherwise, giving 6.1 M station-slots with 7.9% unknown, concentrated in a collection outage on 1–16 Oct 2024.</w:t>
-      </w:r>
-    </w:p>
-    <w:p>
-      <w:pPr>
-        <w:keepNext/>
-        <w:spacing w:after="20" w:before="60" w:line="240"/>
-      </w:pPr>
-      <w:r>
-        <w:rPr>
-          <w:rFonts w:ascii="Times New Roman" w:cs="Times New Roman" w:eastAsia="PMingLiU" w:hAnsi="Times New Roman"/>
-          <w:b/>
-          <w:bCs/>
-          <w:i/>
-          <w:iCs/>
-          <w:color w:val="0000FF"/>
-          <w:sz w:val="20"/>
-          <w:szCs w:val="20"/>
-        </w:rPr>
-        <w:t xml:space="preserve">2.2.4. Study area and calendars</w:t>
-      </w:r>
-    </w:p>
-    <w:p>
-      <w:pPr>
-        <w:spacing w:after="0" w:line="240"/>
-        <w:ind w:firstLine="288"/>
-        <w:jc w:val="both"/>
-      </w:pPr>
-      <w:r>
-        <w:rPr>
-          <w:rFonts w:ascii="Times New Roman" w:cs="Times New Roman" w:eastAsia="PMingLiU" w:hAnsi="Times New Roman"/>
-          <w:color w:val="0000FF"/>
-          <w:sz w:val="20"/>
-          <w:szCs w:val="20"/>
-        </w:rPr>
-        <w:t xml:space="preserve">The NTU study area is the 144 stations within 1.2 km of the campus centroid (59 on campus, 85 in the surrounding ring). Bell times are the period ends of each campus (NTU: 09:00, 10:00, 11:10, 12:10, 13:10, 14:10, 15:10, 16:20, 17:20, 18:20, 19:15, 20:10; NSYSU: on the hour from 10:00 to 18:00, then 19:10, 20:10, 21:10). Taiwanese public holidays and the semester calendars (NTU: 2 Sep 2024–10 Jan 2025 and 17 Feb–13 Jun 2025; NSYSU: from 7 Sep 2026) define the off-day and semester-week features.</w:t>
-      </w:r>
-    </w:p>
-    <w:p>
-      <w:pPr>
-        <w:keepNext/>
-        <w:spacing w:after="30" w:before="90" w:line="240"/>
-      </w:pPr>
-      <w:r>
-        <w:rPr>
-          <w:rFonts w:ascii="Times New Roman" w:cs="Times New Roman" w:eastAsia="PMingLiU" w:hAnsi="Times New Roman"/>
-          <w:b/>
-          <w:bCs/>
-          <w:sz w:val="22"/>
-          <w:szCs w:val="22"/>
-        </w:rPr>
-        <w:t xml:space="preserve">2.3. Demand reconstruction and operator inference</w:t>
-      </w:r>
-    </w:p>
-    <w:p>
-      <w:pPr>
-        <w:spacing w:after="0" w:line="240"/>
-        <w:ind w:firstLine="288"/>
-        <w:jc w:val="both"/>
-      </w:pPr>
-      <w:r>
-        <w:rPr>
-          <w:rFonts w:ascii="Times New Roman" w:cs="Times New Roman" w:eastAsia="PMingLiU" w:hAnsi="Times New Roman"/>
-          <w:sz w:val="20"/>
-          <w:szCs w:val="20"/>
-        </w:rPr>
-        <w:t xml:space="preserve">Per station-hour, the inventory change decomposes into returns, rentals, the operator’s net truck move </w:t>
-      </w:r>
-      <w:r>
-        <w:rPr>
-          <w:rFonts w:ascii="Times New Roman" w:cs="Times New Roman" w:eastAsia="PMingLiU" w:hAnsi="Times New Roman"/>
-          <w:i/>
-          <w:iCs/>
-          <w:sz w:val="20"/>
-          <w:szCs w:val="20"/>
-        </w:rPr>
-        <w:t xml:space="preserve">m</w:t>
-      </w:r>
-      <w:r>
-        <w:rPr>
-          <w:rFonts w:ascii="Times New Roman" w:cs="Times New Roman" w:eastAsia="PMingLiU" w:hAnsi="Times New Roman"/>
-          <w:sz w:val="20"/>
-          <w:szCs w:val="20"/>
-          <w:vertAlign w:val="subscript"/>
-        </w:rPr>
-        <w:t xml:space="preserve">i</w:t>
-      </w:r>
-      <w:r>
-        <w:rPr>
-          <w:rFonts w:ascii="Times New Roman" w:cs="Times New Roman" w:eastAsia="PMingLiU" w:hAnsi="Times New Roman"/>
-          <w:sz w:val="20"/>
-          <w:szCs w:val="20"/>
-        </w:rPr>
-        <w:t xml:space="preserve"> and noise:</w:t>
+        <w:t xml:space="preserve">Both steps are now implemented as written. The inventory identity per station-hour is</w:t>
       </w:r>
     </w:p>
     <w:p>
@@ -1708,6 +1947,7 @@
       <w:r>
         <w:rPr>
           <w:rFonts w:ascii="Times New Roman" w:cs="Times New Roman" w:eastAsia="PMingLiU" w:hAnsi="Times New Roman"/>
+          <w:color w:val="0000FF"/>
           <w:sz w:val="20"/>
           <w:szCs w:val="20"/>
         </w:rPr>
@@ -1718,6 +1958,7 @@
           <w:rFonts w:ascii="Times New Roman" w:cs="Times New Roman" w:eastAsia="PMingLiU" w:hAnsi="Times New Roman"/>
           <w:i/>
           <w:iCs/>
+          <w:color w:val="0000FF"/>
           <w:sz w:val="20"/>
           <w:szCs w:val="20"/>
         </w:rPr>
@@ -1726,6 +1967,7 @@
       <w:r>
         <w:rPr>
           <w:rFonts w:ascii="Times New Roman" w:cs="Times New Roman" w:eastAsia="PMingLiU" w:hAnsi="Times New Roman"/>
+          <w:color w:val="0000FF"/>
           <w:sz w:val="20"/>
           <w:szCs w:val="20"/>
           <w:vertAlign w:val="subscript"/>
@@ -1735,6 +1977,7 @@
       <w:r>
         <w:rPr>
           <w:rFonts w:ascii="Times New Roman" w:cs="Times New Roman" w:eastAsia="PMingLiU" w:hAnsi="Times New Roman"/>
+          <w:color w:val="0000FF"/>
           <w:sz w:val="20"/>
           <w:szCs w:val="20"/>
         </w:rPr>
@@ -1745,6 +1988,7 @@
           <w:rFonts w:ascii="Times New Roman" w:cs="Times New Roman" w:eastAsia="PMingLiU" w:hAnsi="Times New Roman"/>
           <w:i/>
           <w:iCs/>
+          <w:color w:val="0000FF"/>
           <w:sz w:val="20"/>
           <w:szCs w:val="20"/>
         </w:rPr>
@@ -1753,6 +1997,7 @@
       <w:r>
         <w:rPr>
           <w:rFonts w:ascii="Times New Roman" w:cs="Times New Roman" w:eastAsia="PMingLiU" w:hAnsi="Times New Roman"/>
+          <w:color w:val="0000FF"/>
           <w:sz w:val="20"/>
           <w:szCs w:val="20"/>
         </w:rPr>
@@ -1763,6 +2008,7 @@
           <w:rFonts w:ascii="Times New Roman" w:cs="Times New Roman" w:eastAsia="PMingLiU" w:hAnsi="Times New Roman"/>
           <w:i/>
           <w:iCs/>
+          <w:color w:val="0000FF"/>
           <w:sz w:val="20"/>
           <w:szCs w:val="20"/>
         </w:rPr>
@@ -1771,6 +2017,7 @@
       <w:r>
         <w:rPr>
           <w:rFonts w:ascii="Times New Roman" w:cs="Times New Roman" w:eastAsia="PMingLiU" w:hAnsi="Times New Roman"/>
+          <w:color w:val="0000FF"/>
           <w:sz w:val="20"/>
           <w:szCs w:val="20"/>
           <w:vertAlign w:val="subscript"/>
@@ -1780,6 +2027,7 @@
       <w:r>
         <w:rPr>
           <w:rFonts w:ascii="Times New Roman" w:cs="Times New Roman" w:eastAsia="PMingLiU" w:hAnsi="Times New Roman"/>
+          <w:color w:val="0000FF"/>
           <w:sz w:val="20"/>
           <w:szCs w:val="20"/>
         </w:rPr>
@@ -1790,6 +2038,7 @@
           <w:rFonts w:ascii="Times New Roman" w:cs="Times New Roman" w:eastAsia="PMingLiU" w:hAnsi="Times New Roman"/>
           <w:i/>
           <w:iCs/>
+          <w:color w:val="0000FF"/>
           <w:sz w:val="20"/>
           <w:szCs w:val="20"/>
         </w:rPr>
@@ -1798,6 +2047,7 @@
       <w:r>
         <w:rPr>
           <w:rFonts w:ascii="Times New Roman" w:cs="Times New Roman" w:eastAsia="PMingLiU" w:hAnsi="Times New Roman"/>
+          <w:color w:val="0000FF"/>
           <w:sz w:val="20"/>
           <w:szCs w:val="20"/>
         </w:rPr>
@@ -1808,6 +2058,7 @@
           <w:rFonts w:ascii="Times New Roman" w:cs="Times New Roman" w:eastAsia="PMingLiU" w:hAnsi="Times New Roman"/>
           <w:i/>
           <w:iCs/>
+          <w:color w:val="0000FF"/>
           <w:sz w:val="20"/>
           <w:szCs w:val="20"/>
         </w:rPr>
@@ -1816,6 +2067,7 @@
       <w:r>
         <w:rPr>
           <w:rFonts w:ascii="Times New Roman" w:cs="Times New Roman" w:eastAsia="PMingLiU" w:hAnsi="Times New Roman"/>
+          <w:color w:val="0000FF"/>
           <w:sz w:val="20"/>
           <w:szCs w:val="20"/>
           <w:vertAlign w:val="subscript"/>
@@ -1825,6 +2077,7 @@
       <w:r>
         <w:rPr>
           <w:rFonts w:ascii="Times New Roman" w:cs="Times New Roman" w:eastAsia="PMingLiU" w:hAnsi="Times New Roman"/>
+          <w:color w:val="0000FF"/>
           <w:sz w:val="20"/>
           <w:szCs w:val="20"/>
         </w:rPr>
@@ -1835,6 +2088,7 @@
           <w:rFonts w:ascii="Times New Roman" w:cs="Times New Roman" w:eastAsia="PMingLiU" w:hAnsi="Times New Roman"/>
           <w:i/>
           <w:iCs/>
+          <w:color w:val="0000FF"/>
           <w:sz w:val="20"/>
           <w:szCs w:val="20"/>
         </w:rPr>
@@ -1843,6 +2097,7 @@
       <w:r>
         <w:rPr>
           <w:rFonts w:ascii="Times New Roman" w:cs="Times New Roman" w:eastAsia="PMingLiU" w:hAnsi="Times New Roman"/>
+          <w:color w:val="0000FF"/>
           <w:sz w:val="20"/>
           <w:szCs w:val="20"/>
         </w:rPr>
@@ -1853,6 +2108,7 @@
           <w:rFonts w:ascii="Times New Roman" w:cs="Times New Roman" w:eastAsia="PMingLiU" w:hAnsi="Times New Roman"/>
           <w:i/>
           <w:iCs/>
+          <w:color w:val="0000FF"/>
           <w:sz w:val="20"/>
           <w:szCs w:val="20"/>
         </w:rPr>
@@ -1861,6 +2117,7 @@
       <w:r>
         <w:rPr>
           <w:rFonts w:ascii="Times New Roman" w:cs="Times New Roman" w:eastAsia="PMingLiU" w:hAnsi="Times New Roman"/>
+          <w:color w:val="0000FF"/>
           <w:sz w:val="20"/>
           <w:szCs w:val="20"/>
           <w:vertAlign w:val="subscript"/>
@@ -1870,6 +2127,7 @@
       <w:r>
         <w:rPr>
           <w:rFonts w:ascii="Times New Roman" w:cs="Times New Roman" w:eastAsia="PMingLiU" w:hAnsi="Times New Roman"/>
+          <w:color w:val="0000FF"/>
           <w:sz w:val="20"/>
           <w:szCs w:val="20"/>
         </w:rPr>
@@ -1880,6 +2138,7 @@
           <w:rFonts w:ascii="Times New Roman" w:cs="Times New Roman" w:eastAsia="PMingLiU" w:hAnsi="Times New Roman"/>
           <w:i/>
           <w:iCs/>
+          <w:color w:val="0000FF"/>
           <w:sz w:val="20"/>
           <w:szCs w:val="20"/>
         </w:rPr>
@@ -1888,6 +2147,7 @@
       <w:r>
         <w:rPr>
           <w:rFonts w:ascii="Times New Roman" w:cs="Times New Roman" w:eastAsia="PMingLiU" w:hAnsi="Times New Roman"/>
+          <w:color w:val="0000FF"/>
           <w:sz w:val="20"/>
           <w:szCs w:val="20"/>
         </w:rPr>
@@ -1913,16 +2173,18 @@
       <w:r>
         <w:rPr>
           <w:rFonts w:ascii="Times New Roman" w:cs="Times New Roman" w:eastAsia="PMingLiU" w:hAnsi="Times New Roman"/>
-          <w:sz w:val="20"/>
-          <w:szCs w:val="20"/>
-        </w:rPr>
-        <w:t xml:space="preserve">Residuals accumulated over 3-hour windows with |Σ(Δ</w:t>
+          <w:color w:val="0000FF"/>
+          <w:sz w:val="20"/>
+          <w:szCs w:val="20"/>
+        </w:rPr>
+        <w:t xml:space="preserve">and a 3-hour window whose summed residual Σ(Δ</w:t>
       </w:r>
       <w:r>
         <w:rPr>
           <w:rFonts w:ascii="Times New Roman" w:cs="Times New Roman" w:eastAsia="PMingLiU" w:hAnsi="Times New Roman"/>
           <w:i/>
           <w:iCs/>
+          <w:color w:val="0000FF"/>
           <w:sz w:val="20"/>
           <w:szCs w:val="20"/>
         </w:rPr>
@@ -1931,6 +2193,7 @@
       <w:r>
         <w:rPr>
           <w:rFonts w:ascii="Times New Roman" w:cs="Times New Roman" w:eastAsia="PMingLiU" w:hAnsi="Times New Roman"/>
+          <w:color w:val="0000FF"/>
           <w:sz w:val="20"/>
           <w:szCs w:val="20"/>
         </w:rPr>
@@ -1941,6 +2204,7 @@
           <w:rFonts w:ascii="Times New Roman" w:cs="Times New Roman" w:eastAsia="PMingLiU" w:hAnsi="Times New Roman"/>
           <w:i/>
           <w:iCs/>
+          <w:color w:val="0000FF"/>
           <w:sz w:val="20"/>
           <w:szCs w:val="20"/>
         </w:rPr>
@@ -1949,6 +2213,7 @@
       <w:r>
         <w:rPr>
           <w:rFonts w:ascii="Times New Roman" w:cs="Times New Roman" w:eastAsia="PMingLiU" w:hAnsi="Times New Roman"/>
+          <w:color w:val="0000FF"/>
           <w:sz w:val="20"/>
           <w:szCs w:val="20"/>
         </w:rPr>
@@ -1959,6 +2224,7 @@
           <w:rFonts w:ascii="Times New Roman" w:cs="Times New Roman" w:eastAsia="PMingLiU" w:hAnsi="Times New Roman"/>
           <w:i/>
           <w:iCs/>
+          <w:color w:val="0000FF"/>
           <w:sz w:val="20"/>
           <w:szCs w:val="20"/>
         </w:rPr>
@@ -1967,37 +2233,71 @@
       <w:r>
         <w:rPr>
           <w:rFonts w:ascii="Times New Roman" w:cs="Times New Roman" w:eastAsia="PMingLiU" w:hAnsi="Times New Roman"/>
-          <w:sz w:val="20"/>
-          <w:szCs w:val="20"/>
-        </w:rPr>
-        <w:t xml:space="preserve">))| ≥ 5 bikes are labelled as truck moves [10], giving an observed operator policy. For censoring, slots with </w:t>
+          <w:color w:val="0000FF"/>
+          <w:sz w:val="20"/>
+          <w:szCs w:val="20"/>
+        </w:rPr>
+        <w:t xml:space="preserve">)) reaches 5 bikes in absolute value is labelled as a truck move. The censoring-corrected rental rate per station </w:t>
       </w:r>
       <w:r>
         <w:rPr>
           <w:rFonts w:ascii="Times New Roman" w:cs="Times New Roman" w:eastAsia="PMingLiU" w:hAnsi="Times New Roman"/>
           <w:i/>
           <w:iCs/>
-          <w:sz w:val="20"/>
-          <w:szCs w:val="20"/>
-        </w:rPr>
-        <w:t xml:space="preserve">s</w:t>
-      </w:r>
-      <w:r>
-        <w:rPr>
-          <w:rFonts w:ascii="Times New Roman" w:cs="Times New Roman" w:eastAsia="PMingLiU" w:hAnsi="Times New Roman"/>
-          <w:sz w:val="20"/>
-          <w:szCs w:val="20"/>
-          <w:vertAlign w:val="subscript"/>
+          <w:color w:val="0000FF"/>
+          <w:sz w:val="20"/>
+          <w:szCs w:val="20"/>
         </w:rPr>
         <w:t xml:space="preserve">i</w:t>
       </w:r>
       <w:r>
         <w:rPr>
           <w:rFonts w:ascii="Times New Roman" w:cs="Times New Roman" w:eastAsia="PMingLiU" w:hAnsi="Times New Roman"/>
-          <w:sz w:val="20"/>
-          <w:szCs w:val="20"/>
-        </w:rPr>
-        <w:t xml:space="preserve"> = 0 are dropped from the exposure of a Poisson rate model [8, 9]:</w:t>
+          <w:color w:val="0000FF"/>
+          <w:sz w:val="20"/>
+          <w:szCs w:val="20"/>
+        </w:rPr>
+        <w:t xml:space="preserve">, day type </w:t>
+      </w:r>
+      <w:r>
+        <w:rPr>
+          <w:rFonts w:ascii="Times New Roman" w:cs="Times New Roman" w:eastAsia="PMingLiU" w:hAnsi="Times New Roman"/>
+          <w:i/>
+          <w:iCs/>
+          <w:color w:val="0000FF"/>
+          <w:sz w:val="20"/>
+          <w:szCs w:val="20"/>
+        </w:rPr>
+        <w:t xml:space="preserve">d</w:t>
+      </w:r>
+      <w:r>
+        <w:rPr>
+          <w:rFonts w:ascii="Times New Roman" w:cs="Times New Roman" w:eastAsia="PMingLiU" w:hAnsi="Times New Roman"/>
+          <w:color w:val="0000FF"/>
+          <w:sz w:val="20"/>
+          <w:szCs w:val="20"/>
+        </w:rPr>
+        <w:t xml:space="preserve"> (teaching day or off-day) and hour-of-day </w:t>
+      </w:r>
+      <w:r>
+        <w:rPr>
+          <w:rFonts w:ascii="Times New Roman" w:cs="Times New Roman" w:eastAsia="PMingLiU" w:hAnsi="Times New Roman"/>
+          <w:i/>
+          <w:iCs/>
+          <w:color w:val="0000FF"/>
+          <w:sz w:val="20"/>
+          <w:szCs w:val="20"/>
+        </w:rPr>
+        <w:t xml:space="preserve">τ</w:t>
+      </w:r>
+      <w:r>
+        <w:rPr>
+          <w:rFonts w:ascii="Times New Roman" w:cs="Times New Roman" w:eastAsia="PMingLiU" w:hAnsi="Times New Roman"/>
+          <w:color w:val="0000FF"/>
+          <w:sz w:val="20"/>
+          <w:szCs w:val="20"/>
+        </w:rPr>
+        <w:t xml:space="preserve"> is</w:t>
       </w:r>
     </w:p>
     <w:p>
@@ -2221,7 +2521,7 @@
           <w:sz w:val="20"/>
           <w:szCs w:val="20"/>
         </w:rPr>
-        <w:t xml:space="preserve">where the sums run over the hours </w:t>
+        <w:t xml:space="preserve">where the sums run over all hours </w:t>
       </w:r>
       <w:r>
         <w:rPr>
@@ -2241,47 +2541,7 @@
           <w:sz w:val="20"/>
           <w:szCs w:val="20"/>
         </w:rPr>
-        <w:t xml:space="preserve"> of day type </w:t>
-      </w:r>
-      <w:r>
-        <w:rPr>
-          <w:rFonts w:ascii="Times New Roman" w:cs="Times New Roman" w:eastAsia="PMingLiU" w:hAnsi="Times New Roman"/>
-          <w:i/>
-          <w:iCs/>
-          <w:color w:val="0000FF"/>
-          <w:sz w:val="20"/>
-          <w:szCs w:val="20"/>
-        </w:rPr>
-        <w:t xml:space="preserve">d</w:t>
-      </w:r>
-      <w:r>
-        <w:rPr>
-          <w:rFonts w:ascii="Times New Roman" w:cs="Times New Roman" w:eastAsia="PMingLiU" w:hAnsi="Times New Roman"/>
-          <w:color w:val="0000FF"/>
-          <w:sz w:val="20"/>
-          <w:szCs w:val="20"/>
-        </w:rPr>
-        <w:t xml:space="preserve"> and hour-of-day </w:t>
-      </w:r>
-      <w:r>
-        <w:rPr>
-          <w:rFonts w:ascii="Times New Roman" w:cs="Times New Roman" w:eastAsia="PMingLiU" w:hAnsi="Times New Roman"/>
-          <w:i/>
-          <w:iCs/>
-          <w:color w:val="0000FF"/>
-          <w:sz w:val="20"/>
-          <w:szCs w:val="20"/>
-        </w:rPr>
-        <w:t xml:space="preserve">τ</w:t>
-      </w:r>
-      <w:r>
-        <w:rPr>
-          <w:rFonts w:ascii="Times New Roman" w:cs="Times New Roman" w:eastAsia="PMingLiU" w:hAnsi="Times New Roman"/>
-          <w:color w:val="0000FF"/>
-          <w:sz w:val="20"/>
-          <w:szCs w:val="20"/>
-        </w:rPr>
-        <w:t xml:space="preserve">, and </w:t>
+        <w:t xml:space="preserve"> of that type and </w:t>
       </w:r>
       <w:r>
         <w:rPr>
@@ -2467,16 +2727,115 @@
           <w:sz w:val="20"/>
           <w:szCs w:val="20"/>
         </w:rPr>
-        <w:t xml:space="preserve">Features per station and 10-minute slot describe time, the timetable, the station’s state and its neighbours; baselines are persistence and the seasonal mean; the model is gradient boosting with reliability checks. </w:t>
-      </w:r>
-      <w:r>
-        <w:rPr>
-          <w:rFonts w:ascii="Times New Roman" w:cs="Times New Roman" w:eastAsia="PMingLiU" w:hAnsi="Times New Roman"/>
-          <w:color w:val="0000FF"/>
-          <w:sz w:val="20"/>
-          <w:szCs w:val="20"/>
-        </w:rPr>
-        <w:t xml:space="preserve">The implemented predictor is a direct classifier of the label in Eq. (1), built for 06:00–23:00 (features.py, train_predictor.py). Table 1 lists the 28 features; the first 22 need only inventory and are the set used for transfer.</w:t>
+        <w:t xml:space="preserve">Features per station and 10-minute slot: minutes to the next and since the last bell (NTU periods end at 12:10, 15:10, 17:20; NSYSU on the hour), day of week, week of semester, lagged flows (1–3 h, same slot last week), current stock, capacity and stock at the three nearest stations. Baselines: persistence and seasonal mean; then LightGBM with Poisson objectives for rentals and returns; Monte-Carlo roll-out of the inventory over </w:t>
+      </w:r>
+      <w:r>
+        <w:rPr>
+          <w:rFonts w:ascii="Times New Roman" w:cs="Times New Roman" w:eastAsia="PMingLiU" w:hAnsi="Times New Roman"/>
+          <w:i/>
+          <w:iCs/>
+          <w:sz w:val="20"/>
+          <w:szCs w:val="20"/>
+        </w:rPr>
+        <w:t xml:space="preserve">h</w:t>
+      </w:r>
+      <w:r>
+        <w:rPr>
+          <w:rFonts w:ascii="Times New Roman" w:cs="Times New Roman" w:eastAsia="PMingLiU" w:hAnsi="Times New Roman"/>
+          <w:sz w:val="20"/>
+          <w:szCs w:val="20"/>
+        </w:rPr>
+        <w:t xml:space="preserve"> ∈ {15, 30, 60} min, giving P(</w:t>
+      </w:r>
+      <w:r>
+        <w:rPr>
+          <w:rFonts w:ascii="Times New Roman" w:cs="Times New Roman" w:eastAsia="PMingLiU" w:hAnsi="Times New Roman"/>
+          <w:i/>
+          <w:iCs/>
+          <w:sz w:val="20"/>
+          <w:szCs w:val="20"/>
+        </w:rPr>
+        <w:t xml:space="preserve">s</w:t>
+      </w:r>
+      <w:r>
+        <w:rPr>
+          <w:rFonts w:ascii="Times New Roman" w:cs="Times New Roman" w:eastAsia="PMingLiU" w:hAnsi="Times New Roman"/>
+          <w:sz w:val="20"/>
+          <w:szCs w:val="20"/>
+          <w:vertAlign w:val="subscript"/>
+        </w:rPr>
+        <w:t xml:space="preserve">i</w:t>
+      </w:r>
+      <w:r>
+        <w:rPr>
+          <w:rFonts w:ascii="Times New Roman" w:cs="Times New Roman" w:eastAsia="PMingLiU" w:hAnsi="Times New Roman"/>
+          <w:sz w:val="20"/>
+          <w:szCs w:val="20"/>
+        </w:rPr>
+        <w:t xml:space="preserve">(</w:t>
+      </w:r>
+      <w:r>
+        <w:rPr>
+          <w:rFonts w:ascii="Times New Roman" w:cs="Times New Roman" w:eastAsia="PMingLiU" w:hAnsi="Times New Roman"/>
+          <w:i/>
+          <w:iCs/>
+          <w:sz w:val="20"/>
+          <w:szCs w:val="20"/>
+        </w:rPr>
+        <w:t xml:space="preserve">t</w:t>
+      </w:r>
+      <w:r>
+        <w:rPr>
+          <w:rFonts w:ascii="Times New Roman" w:cs="Times New Roman" w:eastAsia="PMingLiU" w:hAnsi="Times New Roman"/>
+          <w:sz w:val="20"/>
+          <w:szCs w:val="20"/>
+        </w:rPr>
+        <w:t xml:space="preserve">+</w:t>
+      </w:r>
+      <w:r>
+        <w:rPr>
+          <w:rFonts w:ascii="Times New Roman" w:cs="Times New Roman" w:eastAsia="PMingLiU" w:hAnsi="Times New Roman"/>
+          <w:i/>
+          <w:iCs/>
+          <w:sz w:val="20"/>
+          <w:szCs w:val="20"/>
+        </w:rPr>
+        <w:t xml:space="preserve">h</w:t>
+      </w:r>
+      <w:r>
+        <w:rPr>
+          <w:rFonts w:ascii="Times New Roman" w:cs="Times New Roman" w:eastAsia="PMingLiU" w:hAnsi="Times New Roman"/>
+          <w:sz w:val="20"/>
+          <w:szCs w:val="20"/>
+        </w:rPr>
+        <w:t xml:space="preserve">) = 0). Metrics: Brier score, AUC and expected calibration error (ECE), since the planner consumes probabilities. Transfer: train on NTU, test on NSYSU with 0–4 weeks of local data.</w:t>
+      </w:r>
+    </w:p>
+    <w:p>
+      <w:pPr>
+        <w:spacing w:after="0" w:line="240"/>
+        <w:ind w:firstLine="288"/>
+        <w:jc w:val="both"/>
+      </w:pPr>
+      <w:r>
+        <w:rPr>
+          <w:rFonts w:ascii="Times New Roman" w:cs="Times New Roman" w:eastAsia="PMingLiU" w:hAnsi="Times New Roman"/>
+          <w:b/>
+          <w:bCs/>
+          <w:color w:val="0000FF"/>
+          <w:sz w:val="20"/>
+          <w:szCs w:val="20"/>
+        </w:rPr>
+        <w:t xml:space="preserve">What was implemented. </w:t>
+      </w:r>
+      <w:r>
+        <w:rPr>
+          <w:rFonts w:ascii="Times New Roman" w:cs="Times New Roman" w:eastAsia="PMingLiU" w:hAnsi="Times New Roman"/>
+          <w:color w:val="0000FF"/>
+          <w:sz w:val="20"/>
+          <w:szCs w:val="20"/>
+        </w:rPr>
+        <w:t xml:space="preserve">Two choices changed against the proposal. First, the label of Eq. (1) is predicted directly by a classifier; the Poisson-rate model with Monte-Carlo roll-out is kept for the next phase, where it will be compared with the classifier on the same test months. Second, the horizons are 30 and 60 min; 15 min was dropped because at 10-minute resolution it leaves a single slot of lead time, too short for a truck to act on. The predictor is built for 06:00–23:00 from the 28 features of Table 1; the first 22 need only inventory and form the set used for transfer (code: features.py, train_predictor.py).</w:t>
       </w:r>
     </w:p>
     <w:p>
@@ -3810,7 +4169,95 @@
           <w:sz w:val="20"/>
           <w:szCs w:val="20"/>
         </w:rPr>
-        <w:t xml:space="preserve">). A discrete-event replay simulator consumes real held-out trips: a rental is served only if stock &gt; 0, otherwise it counts as unmet, while the truck follows the policy under test. Metrics: unmet rentals, empty station-minutes, truck-km.</w:t>
+        <w:t xml:space="preserve">), with </w:t>
+      </w:r>
+      <w:r>
+        <w:rPr>
+          <w:rFonts w:ascii="Times New Roman" w:cs="Times New Roman" w:eastAsia="PMingLiU" w:hAnsi="Times New Roman"/>
+          <w:i/>
+          <w:iCs/>
+          <w:sz w:val="20"/>
+          <w:szCs w:val="20"/>
+        </w:rPr>
+        <w:t xml:space="preserve">D</w:t>
+      </w:r>
+      <w:r>
+        <w:rPr>
+          <w:rFonts w:ascii="Times New Roman" w:cs="Times New Roman" w:eastAsia="PMingLiU" w:hAnsi="Times New Roman"/>
+          <w:sz w:val="20"/>
+          <w:szCs w:val="20"/>
+          <w:vertAlign w:val="subscript"/>
+        </w:rPr>
+        <w:t xml:space="preserve">i</w:t>
+      </w:r>
+      <w:r>
+        <w:rPr>
+          <w:rFonts w:ascii="Times New Roman" w:cs="Times New Roman" w:eastAsia="PMingLiU" w:hAnsi="Times New Roman"/>
+          <w:sz w:val="20"/>
+          <w:szCs w:val="20"/>
+        </w:rPr>
+        <w:t xml:space="preserve"> the predicted demand. Every 10 minutes we rank stations by expected unmet rentals, build a greedy surplus-to-deficit route under capacity </w:t>
+      </w:r>
+      <w:r>
+        <w:rPr>
+          <w:rFonts w:ascii="Times New Roman" w:cs="Times New Roman" w:eastAsia="PMingLiU" w:hAnsi="Times New Roman"/>
+          <w:i/>
+          <w:iCs/>
+          <w:sz w:val="20"/>
+          <w:szCs w:val="20"/>
+        </w:rPr>
+        <w:t xml:space="preserve">Q</w:t>
+      </w:r>
+      <w:r>
+        <w:rPr>
+          <w:rFonts w:ascii="Times New Roman" w:cs="Times New Roman" w:eastAsia="PMingLiU" w:hAnsi="Times New Roman"/>
+          <w:sz w:val="20"/>
+          <w:szCs w:val="20"/>
+        </w:rPr>
+        <w:t xml:space="preserve"> and the bell deadline, and improve it by 2-opt local search and simulated annealing. A discrete-event replay simulator consumes real held-out trips (Apr–Jun 2025): a rental is served only if stock &gt; 0, otherwise it counts as unmet, while the truck follows the policy under test. We compare none, reactive (after an observed stockout), predictive-point and predictive-probabilistic (ours), plus the inferred operator moves, which must first reproduce observed inventories (</w:t>
+      </w:r>
+      <w:r>
+        <w:rPr>
+          <w:rFonts w:ascii="Times New Roman" w:cs="Times New Roman" w:eastAsia="PMingLiU" w:hAnsi="Times New Roman"/>
+          <w:i/>
+          <w:iCs/>
+          <w:sz w:val="20"/>
+          <w:szCs w:val="20"/>
+        </w:rPr>
+        <w:t xml:space="preserve">R</w:t>
+      </w:r>
+      <w:r>
+        <w:rPr>
+          <w:rFonts w:ascii="Times New Roman" w:cs="Times New Roman" w:eastAsia="PMingLiU" w:hAnsi="Times New Roman"/>
+          <w:sz w:val="20"/>
+          <w:szCs w:val="20"/>
+          <w:vertAlign w:val="superscript"/>
+        </w:rPr>
+        <w:t xml:space="preserve">2</w:t>
+      </w:r>
+      <w:r>
+        <w:rPr>
+          <w:rFonts w:ascii="Times New Roman" w:cs="Times New Roman" w:eastAsia="PMingLiU" w:hAnsi="Times New Roman"/>
+          <w:sz w:val="20"/>
+          <w:szCs w:val="20"/>
+        </w:rPr>
+        <w:t xml:space="preserve"> &gt; 0.8). Metrics: unmet rentals, empty station-minutes, truck-km.</w:t>
+      </w:r>
+    </w:p>
+    <w:p>
+      <w:pPr>
+        <w:spacing w:after="0" w:line="240"/>
+        <w:ind w:firstLine="288"/>
+        <w:jc w:val="both"/>
+      </w:pPr>
+      <w:r>
+        <w:rPr>
+          <w:rFonts w:ascii="Times New Roman" w:cs="Times New Roman" w:eastAsia="PMingLiU" w:hAnsi="Times New Roman"/>
+          <w:color w:val="0000FF"/>
+          <w:sz w:val="20"/>
+          <w:szCs w:val="20"/>
+        </w:rPr>
+        <w:t xml:space="preserve">The simulator, the greedy step and the four policy comparisons are implemented; the 2-opt / simulated-annealing improvement is not yet, so every policy below uses the greedy step alone. The operator-move check passed with R² = 0.984 (Sec. 3.3).</w:t>
       </w:r>
     </w:p>
     <w:p>
@@ -4641,7 +5088,7 @@
           <w:sz w:val="20"/>
           <w:szCs w:val="20"/>
         </w:rPr>
-        <w:t xml:space="preserve">The logger already writes latest.json, a compact snapshot of the 309 stations, on every run. The demo page will read it, compute the inventory-only features, show P(empty within 30 min) per station on a map and the next-bell truck plan of the planner, as mocked in Fig. 11.</w:t>
+        <w:t xml:space="preserve">The logger already writes latest.json, a compact snapshot of the 309 stations, on every run. The demo page will read it, compute the inventory-only features, show P(empty within 30 min) per station on a map and the next-bell truck plan of the planner, as mocked in Fig. 12.</w:t>
       </w:r>
     </w:p>
     <w:p>
@@ -5276,7 +5723,23 @@
           <w:sz w:val="20"/>
           <w:szCs w:val="20"/>
         </w:rPr>
-        <w:t xml:space="preserve">Fig. 4 summarizes the eight teaching weekdays of 2–14 Oct 2026 (9–10 Oct are holidays). Campus and KRT exits are the two ends of a tide. Campus stations fill between 08:00 and 10:00 (193 of 231 docks occupied) while both KRT exits are empty in 36% of morning slots; after the 12:00 bell the campus loses 93 bikes (55%) in 20 minutes, recovers over lunch, then drains through the 16:00 and 17:00 bells (−68 and −47 bikes within 40 minutes) to 7 bikes at 18:00, when 64% of campus stations are empty and the KRT exits hold 51 bikes. Fig. 5 aligns the drops on the bell: the 17:00 bell removes 88% of what is left.</w:t>
+        <w:t xml:space="preserve">Figs. 4 and 5 summarize the eight teaching weekdays of 2–14 Oct 2026 (9–10 Oct are holidays). Campus and KRT exits are the two ends of a tide. Campus stations fill between 08:00 and 10:00 (193 of 231 docks occupied) while both KRT exits are empty in 36% of morning slots; after the 12:00 bell the campus loses 93 bikes (55%) in 20 minutes, recovers over lunch, then drains through the 16:00 and 17:00 bells (−68 and −47 bikes within 40 minutes) to 7 bikes at 18:00, when 64% of campus stations are empty and the KRT exits hold 51 bikes. Fig. 6 aligns the drops on the bell: within an hour of the 17:00 bell, 88% of the remaining campus stock is gone.</w:t>
+      </w:r>
+    </w:p>
+    <w:p>
+      <w:pPr>
+        <w:spacing w:after="0" w:line="240"/>
+        <w:ind w:firstLine="288"/>
+        <w:jc w:val="both"/>
+      </w:pPr>
+      <w:r>
+        <w:rPr>
+          <w:rFonts w:ascii="Times New Roman" w:cs="Times New Roman" w:eastAsia="PMingLiU" w:hAnsi="Times New Roman"/>
+          <w:color w:val="0000FF"/>
+          <w:sz w:val="20"/>
+          <w:szCs w:val="20"/>
+        </w:rPr>
+        <w:t xml:space="preserve">The 246 stockout episodes at campus stations amount to 3.8 per station and day, with a median length of 20 min, a mean of 30 min and a 90th percentile of 60 min; in total the eight campus stations spend 934 station-minutes empty per weekday. The morning has the mirror problem: the engineering and library stations have no free dock in 44% and 25% of 08:00–11:00 slots. On weekends the campus holds 40–130 bikes all day and the pattern disappears, which confirms the timetable as the cause.</w:t>
       </w:r>
     </w:p>
     <w:p>
@@ -5288,7 +5751,7 @@
       <w:r>
         <w:drawing>
           <wp:inline distT="0" distB="0" distL="0" distR="0">
-            <wp:extent cx="2943225" cy="2990850"/>
+            <wp:extent cx="2943225" cy="1581150"/>
             <wp:effectExtent t="0" r="0" b="0" l="0"/>
             <wp:docPr id="1" name="" descr="" title=""/>
             <wp:cNvGraphicFramePr>
@@ -5313,7 +5776,7 @@
                   <pic:spPr bwMode="auto">
                     <a:xfrm>
                       <a:off x="0" y="0"/>
-                      <a:ext cx="2943225" cy="2990850"/>
+                      <a:ext cx="2943225" cy="1581150"/>
                     </a:xfrm>
                     <a:prstGeom prst="rect">
                       <a:avLst/>
@@ -5349,23 +5812,7 @@
           <w:sz w:val="17"/>
           <w:szCs w:val="17"/>
         </w:rPr>
-        <w:t xml:space="preserve">NSYSU, eight teaching weekdays in Oct 2026 from our logger. (a) Bikes available at the 8 campus stations and the 2 KRT Sizihwan exits; dashed = weekend campus mean. (b) Probability that a station is empty, by time of day, for the campus stations, the KRT exits and the four busiest gateway stations.</w:t>
-      </w:r>
-    </w:p>
-    <w:p>
-      <w:pPr>
-        <w:spacing w:after="0" w:line="240"/>
-        <w:ind w:firstLine="288"/>
-        <w:jc w:val="both"/>
-      </w:pPr>
-      <w:r>
-        <w:rPr>
-          <w:rFonts w:ascii="Times New Roman" w:cs="Times New Roman" w:eastAsia="PMingLiU" w:hAnsi="Times New Roman"/>
-          <w:color w:val="0000FF"/>
-          <w:sz w:val="20"/>
-          <w:szCs w:val="20"/>
-        </w:rPr>
-        <w:t xml:space="preserve">The 246 stockout episodes at campus stations amount to 3.8 per station and day, with a median length of 20 min, a mean of 30 min and a 90th percentile of 60 min; in total the eight campus stations spend 934 station-minutes empty per weekday. The morning has the mirror problem: the engineering and library stations have no free dock in 44% and 25% of 08:00–11:00 slots. On weekends the campus holds 40–130 bikes all day and the pattern disappears, which confirms the timetable as the cause.</w:t>
+        <w:t xml:space="preserve">NSYSU, eight teaching weekdays in Oct 2026 from our logger: bikes available at the 8 campus stations and the 2 KRT Sizihwan exits (mean, band = IQR); dashed = weekend campus mean.</w:t>
       </w:r>
     </w:p>
     <w:p>
@@ -5377,7 +5824,7 @@
       <w:r>
         <w:drawing>
           <wp:inline distT="0" distB="0" distL="0" distR="0">
-            <wp:extent cx="2943225" cy="1581150"/>
+            <wp:extent cx="2943225" cy="1809750"/>
             <wp:effectExtent t="0" r="0" b="0" l="0"/>
             <wp:docPr id="1" name="" descr="" title=""/>
             <wp:cNvGraphicFramePr>
@@ -5402,7 +5849,7 @@
                   <pic:spPr bwMode="auto">
                     <a:xfrm>
                       <a:off x="0" y="0"/>
-                      <a:ext cx="2943225" cy="1581150"/>
+                      <a:ext cx="2943225" cy="1809750"/>
                     </a:xfrm>
                     <a:prstGeom prst="rect">
                       <a:avLst/>
@@ -5438,40 +5885,7 @@
           <w:sz w:val="17"/>
           <w:szCs w:val="17"/>
         </w:rPr>
-        <w:t xml:space="preserve">Campus stock relative to 10 minutes before the bell, NSYSU weekdays.</w:t>
-      </w:r>
-    </w:p>
-    <w:p>
-      <w:pPr>
-        <w:keepNext/>
-        <w:spacing w:after="30" w:before="90" w:line="240"/>
-      </w:pPr>
-      <w:r>
-        <w:rPr>
-          <w:rFonts w:ascii="Times New Roman" w:cs="Times New Roman" w:eastAsia="PMingLiU" w:hAnsi="Times New Roman"/>
-          <w:b/>
-          <w:bCs/>
-          <w:color w:val="0000FF"/>
-          <w:sz w:val="22"/>
-          <w:szCs w:val="22"/>
-        </w:rPr>
-        <w:t xml:space="preserve">3.3. Demand reconstruction and operator moves at NTU</w:t>
-      </w:r>
-    </w:p>
-    <w:p>
-      <w:pPr>
-        <w:spacing w:after="0" w:line="240"/>
-        <w:ind w:firstLine="288"/>
-        <w:jc w:val="both"/>
-      </w:pPr>
-      <w:r>
-        <w:rPr>
-          <w:rFonts w:ascii="Times New Roman" w:cs="Times New Roman" w:eastAsia="PMingLiU" w:hAnsi="Times New Roman"/>
-          <w:color w:val="0000FF"/>
-          <w:sz w:val="20"/>
-          <w:szCs w:val="20"/>
-        </w:rPr>
-        <w:t xml:space="preserve">Reconciliation covers 917 k station-hours (144 stations, 295 days). On hours without inferred moves, trips alone explain inventory changes with R² = 0.87; adding the inferred moves reproduces the next-hour stock with R² = 0.984 (0.63 without them), so the inferred operator policy passes the proposal’s threshold. The operator moves about 2,550 bikes into and 2,160 bikes out of the area per day, 10% of the 25,700 daily rentals. Fig. 6 shows a reactive pattern: pick-ups from campus peak at 08:00–09:00 after the morning inflow, drop-offs at campus peak at 16:00–17:00, and the ring is emptied at 17:00; only 19% of campus drop-offs happen in the hour before a major bell.</w:t>
+        <w:t xml:space="preserve">Probability that a station is empty, by time of day on teaching weekdays, for the campus stations, the KRT exits and the four busiest gateway stations.</w:t>
       </w:r>
     </w:p>
     <w:p>
@@ -5483,7 +5897,7 @@
       <w:r>
         <w:drawing>
           <wp:inline distT="0" distB="0" distL="0" distR="0">
-            <wp:extent cx="2943225" cy="1809750"/>
+            <wp:extent cx="2943225" cy="1581150"/>
             <wp:effectExtent t="0" r="0" b="0" l="0"/>
             <wp:docPr id="1" name="" descr="" title=""/>
             <wp:cNvGraphicFramePr>
@@ -5508,7 +5922,7 @@
                   <pic:spPr bwMode="auto">
                     <a:xfrm>
                       <a:off x="0" y="0"/>
-                      <a:ext cx="2943225" cy="1809750"/>
+                      <a:ext cx="2943225" cy="1581150"/>
                     </a:xfrm>
                     <a:prstGeom prst="rect">
                       <a:avLst/>
@@ -5544,7 +5958,24 @@
           <w:sz w:val="17"/>
           <w:szCs w:val="17"/>
         </w:rPr>
-        <w:t xml:space="preserve">Inferred truck moves per hour and day at the 59 campus and 85 ring stations (bikes dropped off above the axis, picked up below). Dashed lines: 12:10 and 17:20 bells.</w:t>
+        <w:t xml:space="preserve">Campus stock relative to 10 minutes before the bell, NSYSU weekdays.</w:t>
+      </w:r>
+    </w:p>
+    <w:p>
+      <w:pPr>
+        <w:keepNext/>
+        <w:spacing w:after="30" w:before="90" w:line="240"/>
+      </w:pPr>
+      <w:r>
+        <w:rPr>
+          <w:rFonts w:ascii="Times New Roman" w:cs="Times New Roman" w:eastAsia="PMingLiU" w:hAnsi="Times New Roman"/>
+          <w:b/>
+          <w:bCs/>
+          <w:color w:val="0000FF"/>
+          <w:sz w:val="22"/>
+          <w:szCs w:val="22"/>
+        </w:rPr>
+        <w:t xml:space="preserve">3.3. Demand reconstruction and operator moves at NTU</w:t>
       </w:r>
     </w:p>
     <w:p>
@@ -5560,7 +5991,23 @@
           <w:sz w:val="20"/>
           <w:szCs w:val="20"/>
         </w:rPr>
-        <w:t xml:space="preserve">Fig. 7 shows the censoring correction for campus stations on weekdays: observed rentals understate demand by 8% at 12:00, 17% at 17:00, 39% at 18:00 and 2.1× at 22:00, because campus stations are empty 46% of the time at 17:00–19:00. These corrected rates are the demand input of the planner.</w:t>
+        <w:t xml:space="preserve">Reconciliation covers 917 k station-hours (144 stations, 295 days). On hours without inferred moves, trips alone explain inventory changes with R² = 0.87; adding the inferred moves reproduces the next-hour stock with R² = 0.984 (0.63 without them), so the inferred operator policy passes the proposal’s threshold. At the 144 stations the operator drops off about 2,550 and picks up about 2,160 bikes per day, 10% of the 25,700 daily rentals. Fig. 7 shows a reactive pattern: pick-ups from campus peak at 08:00–09:00 after the morning inflow, drop-offs at campus peak at 16:00–17:00, and the ring is emptied at 17:00; only 19% of campus drop-offs happen in the hour before a major bell.</w:t>
+      </w:r>
+    </w:p>
+    <w:p>
+      <w:pPr>
+        <w:spacing w:after="0" w:line="240"/>
+        <w:ind w:firstLine="288"/>
+        <w:jc w:val="both"/>
+      </w:pPr>
+      <w:r>
+        <w:rPr>
+          <w:rFonts w:ascii="Times New Roman" w:cs="Times New Roman" w:eastAsia="PMingLiU" w:hAnsi="Times New Roman"/>
+          <w:color w:val="0000FF"/>
+          <w:sz w:val="20"/>
+          <w:szCs w:val="20"/>
+        </w:rPr>
+        <w:t xml:space="preserve">Fig. 8 shows the censoring correction for campus stations on weekdays: observed rentals understate demand by 8% at 12:00, 17% at 17:00, 39% at 18:00 and 2.1× at 22:00, because campus stations are empty 46% of the time at 17:00–19:00. These corrected rates are the demand input of the planner.</w:t>
       </w:r>
     </w:p>
     <w:p>
@@ -5572,7 +6019,7 @@
       <w:r>
         <w:drawing>
           <wp:inline distT="0" distB="0" distL="0" distR="0">
-            <wp:extent cx="2943225" cy="1543050"/>
+            <wp:extent cx="2943225" cy="1809750"/>
             <wp:effectExtent t="0" r="0" b="0" l="0"/>
             <wp:docPr id="1" name="" descr="" title=""/>
             <wp:cNvGraphicFramePr>
@@ -5597,6 +6044,79 @@
                   <pic:spPr bwMode="auto">
                     <a:xfrm>
                       <a:off x="0" y="0"/>
+                      <a:ext cx="2943225" cy="1809750"/>
+                    </a:xfrm>
+                    <a:prstGeom prst="rect">
+                      <a:avLst/>
+                    </a:prstGeom>
+                  </pic:spPr>
+                </pic:pic>
+              </a:graphicData>
+            </a:graphic>
+          </wp:inline>
+        </w:drawing>
+      </w:r>
+    </w:p>
+    <w:p>
+      <w:pPr>
+        <w:spacing w:after="140" w:before="0" w:line="200"/>
+        <w:jc w:val="both"/>
+      </w:pPr>
+      <w:r>
+        <w:rPr>
+          <w:rFonts w:ascii="Times New Roman" w:cs="Times New Roman" w:eastAsia="PMingLiU" w:hAnsi="Times New Roman"/>
+          <w:b/>
+          <w:bCs/>
+          <w:color w:val="0000FF"/>
+          <w:sz w:val="17"/>
+          <w:szCs w:val="17"/>
+        </w:rPr>
+        <w:t xml:space="preserve">Figure 7. </w:t>
+      </w:r>
+      <w:r>
+        <w:rPr>
+          <w:rFonts w:ascii="Times New Roman" w:cs="Times New Roman" w:eastAsia="PMingLiU" w:hAnsi="Times New Roman"/>
+          <w:color w:val="0000FF"/>
+          <w:sz w:val="17"/>
+          <w:szCs w:val="17"/>
+        </w:rPr>
+        <w:t xml:space="preserve">Inferred truck moves per hour and day at the 59 campus and 85 ring stations (bikes dropped off above the axis, picked up below). Dashed lines: 12:10 and 17:20 bells.</w:t>
+      </w:r>
+    </w:p>
+    <w:p>
+      <w:pPr>
+        <w:keepNext/>
+        <w:spacing w:after="40" w:before="120"/>
+        <w:jc w:val="center"/>
+      </w:pPr>
+      <w:r>
+        <w:drawing>
+          <wp:inline distT="0" distB="0" distL="0" distR="0">
+            <wp:extent cx="2943225" cy="1543050"/>
+            <wp:effectExtent t="0" r="0" b="0" l="0"/>
+            <wp:docPr id="1" name="" descr="" title=""/>
+            <wp:cNvGraphicFramePr>
+              <a:graphicFrameLocks xmlns:a="http://schemas.openxmlformats.org/drawingml/2006/main" noChangeAspect="1"/>
+            </wp:cNvGraphicFramePr>
+            <a:graphic xmlns:a="http://schemas.openxmlformats.org/drawingml/2006/main">
+              <a:graphicData uri="http://schemas.openxmlformats.org/drawingml/2006/picture">
+                <pic:pic xmlns:pic="http://schemas.openxmlformats.org/drawingml/2006/picture">
+                  <pic:nvPicPr>
+                    <pic:cNvPr id="0" name="" descr=""/>
+                    <pic:cNvPicPr>
+                      <a:picLocks noChangeAspect="1" noChangeArrowheads="1"/>
+                    </pic:cNvPicPr>
+                  </pic:nvPicPr>
+                  <pic:blipFill>
+                    <a:blip r:embed="rId14" cstate="none"/>
+                    <a:srcRect/>
+                    <a:stretch>
+                      <a:fillRect/>
+                    </a:stretch>
+                  </pic:blipFill>
+                  <pic:spPr bwMode="auto">
+                    <a:xfrm>
+                      <a:off x="0" y="0"/>
                       <a:ext cx="2943225" cy="1543050"/>
                     </a:xfrm>
                     <a:prstGeom prst="rect">
@@ -5624,7 +6144,7 @@
           <w:sz w:val="17"/>
           <w:szCs w:val="17"/>
         </w:rPr>
-        <w:t xml:space="preserve">Figure 7. </w:t>
+        <w:t xml:space="preserve">Figure 8. </w:t>
       </w:r>
       <w:r>
         <w:rPr>
@@ -5666,7 +6186,7 @@
           <w:sz w:val="20"/>
           <w:szCs w:val="20"/>
         </w:rPr>
-        <w:t xml:space="preserve">Table 3 and Fig. 8 give the test results. At the 30-minute horizon the full model reaches AUC 0.931 and Brier 0.080, against 0.818 / 0.126 for the seasonal baseline and 0.742 / 0.125 for persistence; the inventory-only model is close behind (0.921 / 0.084), so trip flows add little once the current stock and its trend are known. Calibration is good without post-processing: ECE 0.012 and a reliability curve on the diagonal up to p = 0.9 (Fig. 8a), while the seasonal baseline under-predicts at high probabilities. Performance is higher on campus stations (AUC 0.945) and lower in the 40 minutes after a major bell (0.905), where the surge is fastest. At 60 minutes AUC drops to 0.916 (full) and 0.898 (inventory-only).</w:t>
+        <w:t xml:space="preserve">Table 3 and Fig. 9 give the test results. At the 30-minute horizon the full model reaches AUC 0.931 and Brier 0.080, against 0.818 / 0.126 for the seasonal baseline and 0.742 / 0.125 for persistence; the inventory-only model is close behind (0.921 / 0.084), so trip flows add little once the current stock and its trend are known. Calibration is good without post-processing: ECE 0.012 and a reliability curve on the diagonal up to p = 0.9 (Fig. 9a), while the seasonal baseline under-predicts at high probabilities. Performance is higher on campus stations (AUC 0.945) and lower in the 40 minutes after a major bell (0.905), where the surge is fastest. At 60 minutes AUC drops to 0.916 (full) and 0.898 (inventory-only).</w:t>
       </w:r>
     </w:p>
     <w:p>
@@ -7481,7 +8001,7 @@
                     </pic:cNvPicPr>
                   </pic:nvPicPr>
                   <pic:blipFill>
-                    <a:blip r:embed="rId14" cstate="none"/>
+                    <a:blip r:embed="rId15" cstate="none"/>
                     <a:srcRect/>
                     <a:stretch>
                       <a:fillRect/>
@@ -7517,7 +8037,7 @@
           <w:sz w:val="17"/>
           <w:szCs w:val="17"/>
         </w:rPr>
-        <w:t xml:space="preserve">Figure 8. </w:t>
+        <w:t xml:space="preserve">Figure 9. </w:t>
       </w:r>
       <w:r>
         <w:rPr>
@@ -7542,7 +8062,7 @@
           <w:sz w:val="20"/>
           <w:szCs w:val="20"/>
         </w:rPr>
-        <w:t xml:space="preserve">By gain, the current stock (49%), its one-hour minimum (20%), the station id (8%) and the fill ratio (5%) dominate. The bell features contribute almost nothing: the ablation without group B changes AUC by less than 0.002 on every subset, including campus slots 0–30 min before a bell. Hour of day already encodes a fixed timetable. The hard cases are stations that are still well stocked 30 minutes before a bell (AUC 0.79 at h = 30); they are the target of the second half, through longer horizons, demand-rate features from Sec. 2.3 and a timetable-intensity feature built from the course catalogue (number of classes ending at each period on each weekday).</w:t>
+        <w:t xml:space="preserve">By gain, the current stock (49%), its one-hour minimum (20%), the station id (8%) and the fill ratio (5%) dominate. The bell features contribute almost nothing: the ablation without group B changes AUC by at most 0.002 on every subset, including campus slots 0–30 min before a bell. Hour of day already encodes a fixed timetable. The hard cases are stations that are still well stocked 30 minutes before a bell (AUC 0.79 at h = 30); they are the target of the second half, through longer horizons, demand-rate features from Sec. 2.3 and a timetable-intensity feature built from the course catalogue (number of classes ending at each period on each weekday).</w:t>
       </w:r>
     </w:p>
     <w:p>
@@ -7575,7 +8095,7 @@
           <w:sz w:val="20"/>
           <w:szCs w:val="20"/>
         </w:rPr>
-        <w:t xml:space="preserve">Fig. 9 and Table 4 show that the inventory-only NTU model works at NSYSU without any local data: zero-shot AUC 0.934 on all 309 Kaohsiung stations and 0.944 on the 8 campus stations at h = 30, with Brier 0.049 / 0.068 and ECE 0.022 / 0.020. Fine-tuning on six NSYSU days adds 0.006 AUC and improves ECE to 0.003 on all stations; a model trained only on those six days is equally good (0.940), while the seasonal baseline from six days is poor (0.651). The proposal expected a zero-shot drop that local data would close; instead the dynamics of a station emptying generalize across cities almost perfectly, and the only transfer gap is in calibration, which six days of local data remove. At h = 60 the figures are 0.892 zero-shot and 0.906 fine-tuned.</w:t>
+        <w:t xml:space="preserve">Fig. 10 and Table 4 show that the inventory-only NTU model works at NSYSU without any local data: zero-shot AUC 0.934 on all 309 Kaohsiung stations and 0.944 on the 8 campus stations at h = 30, with Brier 0.049 / 0.068 and ECE 0.022 / 0.020. Fine-tuning on six NSYSU days adds 0.006 AUC and improves ECE to 0.003 on all stations; a model trained only on those six days is equally good (0.940), while the seasonal baseline from six days is poor (0.651). The proposal expected a zero-shot drop that local data would close; instead the dynamics of a station emptying generalize across cities almost perfectly, and the only transfer gap is in calibration, which six days of local data remove. At h = 60 the figures are 0.892 zero-shot and 0.906 fine-tuned.</w:t>
       </w:r>
     </w:p>
     <w:p>
@@ -8253,7 +8773,7 @@
                     </pic:cNvPicPr>
                   </pic:nvPicPr>
                   <pic:blipFill>
-                    <a:blip r:embed="rId15" cstate="none"/>
+                    <a:blip r:embed="rId16" cstate="none"/>
                     <a:srcRect/>
                     <a:stretch>
                       <a:fillRect/>
@@ -8289,7 +8809,7 @@
           <w:sz w:val="17"/>
           <w:szCs w:val="17"/>
         </w:rPr>
-        <w:t xml:space="preserve">Figure 9. </w:t>
+        <w:t xml:space="preserve">Figure 10. </w:t>
       </w:r>
       <w:r>
         <w:rPr>
@@ -8331,7 +8851,7 @@
           <w:sz w:val="20"/>
           <w:szCs w:val="20"/>
         </w:rPr>
-        <w:t xml:space="preserve">Over the 28 replayed weekdays the area records 32,100 rentals per day; without rebalancing 3,390 of them (10.5%) find an empty station and the 144 stations spend 17,800 station-minutes empty per day. Table 5 and Fig. 10 give the policies. One truck avoids 5–8% of unmet rentals with 55–67 km of driving; three trucks 16–17%; six trucks 25–27%. The probabilistic policy is best on every fleet size and the point-forecast policy worst, but the margins on unmet rentals are small (27% vs. 26% vs. 25% with six trucks). The clearest difference is in empty station-minutes, which the probabilistic and reactive policies cut by 41% with six trucks against 14% for the point policy, because the latter waits for a forecast deficit instead of acting on an empty station. Replaying the inferred operator moves, which inject about 5,100 bikes per day without any truck constraint, avoids 61%; it is an upper reference, not a policy.</w:t>
+        <w:t xml:space="preserve">Over the 28 replayed weekdays the area records 32,100 rentals per day; without rebalancing 3,390 of them (10.5%) find an empty station and the 144 stations spend 17,800 station-minutes empty per day. Table 5 and Fig. 11 give the results per policy. One truck avoids 5–8% of unmet rentals with 55–67 km of driving; three trucks 16–17%; six trucks 25–27%. The probabilistic policy is best on every fleet size and the point-forecast policy worst, but the margins on unmet rentals are small (27% vs. 26% vs. 25% with six trucks). The clearest difference is in empty station-minutes, which the probabilistic and reactive policies cut by 41% with six trucks against 14% for the point policy, because the latter waits for a forecast deficit instead of acting on an empty station. Replaying the inferred operator moves, which inject about 5,100 bikes per day without any truck constraint, avoids 61%; it is an upper reference, not a policy.</w:t>
       </w:r>
     </w:p>
     <w:p>
@@ -10719,7 +11239,7 @@
                     </pic:cNvPicPr>
                   </pic:nvPicPr>
                   <pic:blipFill>
-                    <a:blip r:embed="rId16" cstate="none"/>
+                    <a:blip r:embed="rId17" cstate="none"/>
                     <a:srcRect/>
                     <a:stretch>
                       <a:fillRect/>
@@ -10755,7 +11275,7 @@
           <w:sz w:val="17"/>
           <w:szCs w:val="17"/>
         </w:rPr>
-        <w:t xml:space="preserve">Figure 10. </w:t>
+        <w:t xml:space="preserve">Figure 11. </w:t>
       </w:r>
       <w:r>
         <w:rPr>
@@ -10813,7 +11333,771 @@
           <w:sz w:val="20"/>
           <w:szCs w:val="20"/>
         </w:rPr>
-        <w:t xml:space="preserve">Fig. 12 updates the schedule: data pipeline and demand reconstruction are complete, the predictor is trained and transferred ahead of plan, and the simulator exists two weeks early, with the planner still greedy. Of the proposal’s three fallbacks, none was needed: Kaohsiung history is being collected by our own logger, the probabilistic policy does beat the point forecast, and local search is on schedule. Remaining work:</w:t>
+        <w:t xml:space="preserve">Table 6 sets the numbers the proposal expected against what the midterm experiments gave. The predictor met every target, and transfer was easier than expected. The simulator numbers fall short of the proposal’s 50%, for three reasons that the next phase addresses: the planner is the greedy initial solution without route search; the replay contains only recorded rentals, so the demand that was lost at empty stations, which rebalancing would serve, is not yet counted; and the operator reference injects bikes without any truck constraint.</w:t>
+      </w:r>
+    </w:p>
+    <w:p>
+      <w:pPr>
+        <w:keepNext/>
+        <w:spacing w:after="50" w:before="100" w:line="220"/>
+        <w:jc w:val="both"/>
+      </w:pPr>
+      <w:r>
+        <w:rPr>
+          <w:rFonts w:ascii="Times New Roman" w:cs="Times New Roman" w:eastAsia="PMingLiU" w:hAnsi="Times New Roman"/>
+          <w:b/>
+          <w:bCs/>
+          <w:color w:val="0000FF"/>
+          <w:sz w:val="17"/>
+          <w:szCs w:val="17"/>
+        </w:rPr>
+        <w:t xml:space="preserve">Table 6. </w:t>
+      </w:r>
+      <w:r>
+        <w:rPr>
+          <w:rFonts w:ascii="Times New Roman" w:cs="Times New Roman" w:eastAsia="PMingLiU" w:hAnsi="Times New Roman"/>
+          <w:color w:val="0000FF"/>
+          <w:sz w:val="17"/>
+          <w:szCs w:val="17"/>
+        </w:rPr>
+        <w:t xml:space="preserve">Proposal expectations (HW1, Sec. 3) against midterm results.</w:t>
+      </w:r>
+    </w:p>
+    <w:tbl>
+      <w:tblPr>
+        <w:tblW w:type="dxa" w:w="4677"/>
+        <w:tblBorders>
+          <w:top w:val="single" w:color="999999" w:sz="4"/>
+          <w:left w:val="none" w:color="FFFFFF" w:sz="0"/>
+          <w:bottom w:val="single" w:color="999999" w:sz="4"/>
+          <w:right w:val="none" w:color="FFFFFF" w:sz="0"/>
+          <w:insideH w:val="single" w:color="BBBBBB" w:sz="2"/>
+          <w:insideV w:val="none" w:color="FFFFFF" w:sz="0"/>
+        </w:tblBorders>
+      </w:tblPr>
+      <w:tblGrid>
+        <w:gridCol w:w="1877"/>
+        <w:gridCol w:w="1300"/>
+        <w:gridCol w:w="1500"/>
+      </w:tblGrid>
+      <w:tr>
+        <w:trPr>
+          <w:cantSplit/>
+          <w:tblHeader/>
+        </w:trPr>
+        <w:tc>
+          <w:tcPr>
+            <w:tcW w:type="dxa" w:w="1877"/>
+            <w:shd w:fill="EDEDED" w:color="auto" w:val="clear"/>
+            <w:tcMar>
+              <w:top w:type="dxa" w:w="14"/>
+              <w:left w:type="dxa" w:w="50"/>
+              <w:bottom w:type="dxa" w:w="14"/>
+              <w:right w:type="dxa" w:w="50"/>
+            </w:tcMar>
+            <w:vAlign w:val="center"/>
+          </w:tcPr>
+          <w:p>
+            <w:pPr>
+              <w:keepNext/>
+              <w:keepLines/>
+              <w:spacing w:after="0" w:line="210"/>
+              <w:jc w:val="left"/>
+            </w:pPr>
+            <w:r>
+              <w:rPr>
+                <w:rFonts w:ascii="Times New Roman" w:cs="Times New Roman" w:eastAsia="PMingLiU" w:hAnsi="Times New Roman"/>
+                <w:b/>
+                <w:bCs/>
+                <w:color w:val="0000FF"/>
+                <w:sz w:val="15"/>
+                <w:szCs w:val="15"/>
+              </w:rPr>
+              <w:t xml:space="preserve">Quantity</w:t>
+            </w:r>
+          </w:p>
+        </w:tc>
+        <w:tc>
+          <w:tcPr>
+            <w:tcW w:type="dxa" w:w="1300"/>
+            <w:shd w:fill="EDEDED" w:color="auto" w:val="clear"/>
+            <w:tcMar>
+              <w:top w:type="dxa" w:w="14"/>
+              <w:left w:type="dxa" w:w="50"/>
+              <w:bottom w:type="dxa" w:w="14"/>
+              <w:right w:type="dxa" w:w="50"/>
+            </w:tcMar>
+            <w:vAlign w:val="center"/>
+          </w:tcPr>
+          <w:p>
+            <w:pPr>
+              <w:keepNext/>
+              <w:keepLines/>
+              <w:spacing w:after="0" w:line="210"/>
+              <w:jc w:val="left"/>
+            </w:pPr>
+            <w:r>
+              <w:rPr>
+                <w:rFonts w:ascii="Times New Roman" w:cs="Times New Roman" w:eastAsia="PMingLiU" w:hAnsi="Times New Roman"/>
+                <w:b/>
+                <w:bCs/>
+                <w:color w:val="0000FF"/>
+                <w:sz w:val="15"/>
+                <w:szCs w:val="15"/>
+              </w:rPr>
+              <w:t xml:space="preserve">Expected (HW1)</w:t>
+            </w:r>
+          </w:p>
+        </w:tc>
+        <w:tc>
+          <w:tcPr>
+            <w:tcW w:type="dxa" w:w="1500"/>
+            <w:shd w:fill="EDEDED" w:color="auto" w:val="clear"/>
+            <w:tcMar>
+              <w:top w:type="dxa" w:w="14"/>
+              <w:left w:type="dxa" w:w="50"/>
+              <w:bottom w:type="dxa" w:w="14"/>
+              <w:right w:type="dxa" w:w="50"/>
+            </w:tcMar>
+            <w:vAlign w:val="center"/>
+          </w:tcPr>
+          <w:p>
+            <w:pPr>
+              <w:keepNext/>
+              <w:keepLines/>
+              <w:spacing w:after="0" w:line="210"/>
+              <w:jc w:val="left"/>
+            </w:pPr>
+            <w:r>
+              <w:rPr>
+                <w:rFonts w:ascii="Times New Roman" w:cs="Times New Roman" w:eastAsia="PMingLiU" w:hAnsi="Times New Roman"/>
+                <w:b/>
+                <w:bCs/>
+                <w:color w:val="0000FF"/>
+                <w:sz w:val="15"/>
+                <w:szCs w:val="15"/>
+              </w:rPr>
+              <w:t xml:space="preserve">Midterm</w:t>
+            </w:r>
+          </w:p>
+        </w:tc>
+      </w:tr>
+      <w:tr>
+        <w:trPr>
+          <w:cantSplit/>
+        </w:trPr>
+        <w:tc>
+          <w:tcPr>
+            <w:tcW w:type="dxa" w:w="1877"/>
+            <w:tcMar>
+              <w:top w:type="dxa" w:w="14"/>
+              <w:left w:type="dxa" w:w="50"/>
+              <w:bottom w:type="dxa" w:w="14"/>
+              <w:right w:type="dxa" w:w="50"/>
+            </w:tcMar>
+            <w:vAlign w:val="center"/>
+          </w:tcPr>
+          <w:p>
+            <w:pPr>
+              <w:keepNext/>
+              <w:keepLines/>
+              <w:spacing w:after="0" w:line="210"/>
+              <w:jc w:val="left"/>
+            </w:pPr>
+            <w:r>
+              <w:rPr>
+                <w:rFonts w:ascii="Times New Roman" w:cs="Times New Roman" w:eastAsia="PMingLiU" w:hAnsi="Times New Roman"/>
+                <w:b w:val="false"/>
+                <w:bCs w:val="false"/>
+                <w:color w:val="0000FF"/>
+                <w:sz w:val="15"/>
+                <w:szCs w:val="15"/>
+              </w:rPr>
+              <w:t xml:space="preserve">Predictor AUC, h = 30 min</w:t>
+            </w:r>
+          </w:p>
+        </w:tc>
+        <w:tc>
+          <w:tcPr>
+            <w:tcW w:type="dxa" w:w="1300"/>
+            <w:tcMar>
+              <w:top w:type="dxa" w:w="14"/>
+              <w:left w:type="dxa" w:w="50"/>
+              <w:bottom w:type="dxa" w:w="14"/>
+              <w:right w:type="dxa" w:w="50"/>
+            </w:tcMar>
+            <w:vAlign w:val="center"/>
+          </w:tcPr>
+          <w:p>
+            <w:pPr>
+              <w:keepNext/>
+              <w:keepLines/>
+              <w:spacing w:after="0" w:line="210"/>
+              <w:jc w:val="left"/>
+            </w:pPr>
+            <w:r>
+              <w:rPr>
+                <w:rFonts w:ascii="Times New Roman" w:cs="Times New Roman" w:eastAsia="PMingLiU" w:hAnsi="Times New Roman"/>
+                <w:b w:val="false"/>
+                <w:bCs w:val="false"/>
+                <w:color w:val="0000FF"/>
+                <w:sz w:val="15"/>
+                <w:szCs w:val="15"/>
+              </w:rPr>
+              <w:t xml:space="preserve">&gt; 0.85</w:t>
+            </w:r>
+          </w:p>
+        </w:tc>
+        <w:tc>
+          <w:tcPr>
+            <w:tcW w:type="dxa" w:w="1500"/>
+            <w:tcMar>
+              <w:top w:type="dxa" w:w="14"/>
+              <w:left w:type="dxa" w:w="50"/>
+              <w:bottom w:type="dxa" w:w="14"/>
+              <w:right w:type="dxa" w:w="50"/>
+            </w:tcMar>
+            <w:vAlign w:val="center"/>
+          </w:tcPr>
+          <w:p>
+            <w:pPr>
+              <w:keepNext/>
+              <w:keepLines/>
+              <w:spacing w:after="0" w:line="210"/>
+              <w:jc w:val="left"/>
+            </w:pPr>
+            <w:r>
+              <w:rPr>
+                <w:rFonts w:ascii="Times New Roman" w:cs="Times New Roman" w:eastAsia="PMingLiU" w:hAnsi="Times New Roman"/>
+                <w:b w:val="false"/>
+                <w:bCs w:val="false"/>
+                <w:color w:val="0000FF"/>
+                <w:sz w:val="15"/>
+                <w:szCs w:val="15"/>
+              </w:rPr>
+              <w:t xml:space="preserve">0.93 (NTU), 0.93 (NSYSU zero-shot)</w:t>
+            </w:r>
+          </w:p>
+        </w:tc>
+      </w:tr>
+      <w:tr>
+        <w:trPr>
+          <w:cantSplit/>
+        </w:trPr>
+        <w:tc>
+          <w:tcPr>
+            <w:tcW w:type="dxa" w:w="1877"/>
+            <w:tcMar>
+              <w:top w:type="dxa" w:w="14"/>
+              <w:left w:type="dxa" w:w="50"/>
+              <w:bottom w:type="dxa" w:w="14"/>
+              <w:right w:type="dxa" w:w="50"/>
+            </w:tcMar>
+            <w:vAlign w:val="center"/>
+          </w:tcPr>
+          <w:p>
+            <w:pPr>
+              <w:keepNext w:val="false"/>
+              <w:keepLines/>
+              <w:spacing w:after="0" w:line="210"/>
+              <w:jc w:val="left"/>
+            </w:pPr>
+            <w:r>
+              <w:rPr>
+                <w:rFonts w:ascii="Times New Roman" w:cs="Times New Roman" w:eastAsia="PMingLiU" w:hAnsi="Times New Roman"/>
+                <w:b w:val="false"/>
+                <w:bCs w:val="false"/>
+                <w:color w:val="0000FF"/>
+                <w:sz w:val="15"/>
+                <w:szCs w:val="15"/>
+              </w:rPr>
+              <w:t xml:space="preserve">Predictor ECE, h = 30 min</w:t>
+            </w:r>
+          </w:p>
+        </w:tc>
+        <w:tc>
+          <w:tcPr>
+            <w:tcW w:type="dxa" w:w="1300"/>
+            <w:tcMar>
+              <w:top w:type="dxa" w:w="14"/>
+              <w:left w:type="dxa" w:w="50"/>
+              <w:bottom w:type="dxa" w:w="14"/>
+              <w:right w:type="dxa" w:w="50"/>
+            </w:tcMar>
+            <w:vAlign w:val="center"/>
+          </w:tcPr>
+          <w:p>
+            <w:pPr>
+              <w:keepNext w:val="false"/>
+              <w:keepLines/>
+              <w:spacing w:after="0" w:line="210"/>
+              <w:jc w:val="left"/>
+            </w:pPr>
+            <w:r>
+              <w:rPr>
+                <w:rFonts w:ascii="Times New Roman" w:cs="Times New Roman" w:eastAsia="PMingLiU" w:hAnsi="Times New Roman"/>
+                <w:b w:val="false"/>
+                <w:bCs w:val="false"/>
+                <w:color w:val="0000FF"/>
+                <w:sz w:val="15"/>
+                <w:szCs w:val="15"/>
+              </w:rPr>
+              <w:t xml:space="preserve">&lt; 0.05</w:t>
+            </w:r>
+          </w:p>
+        </w:tc>
+        <w:tc>
+          <w:tcPr>
+            <w:tcW w:type="dxa" w:w="1500"/>
+            <w:tcMar>
+              <w:top w:type="dxa" w:w="14"/>
+              <w:left w:type="dxa" w:w="50"/>
+              <w:bottom w:type="dxa" w:w="14"/>
+              <w:right w:type="dxa" w:w="50"/>
+            </w:tcMar>
+            <w:vAlign w:val="center"/>
+          </w:tcPr>
+          <w:p>
+            <w:pPr>
+              <w:keepNext w:val="false"/>
+              <w:keepLines/>
+              <w:spacing w:after="0" w:line="210"/>
+              <w:jc w:val="left"/>
+            </w:pPr>
+            <w:r>
+              <w:rPr>
+                <w:rFonts w:ascii="Times New Roman" w:cs="Times New Roman" w:eastAsia="PMingLiU" w:hAnsi="Times New Roman"/>
+                <w:b w:val="false"/>
+                <w:bCs w:val="false"/>
+                <w:color w:val="0000FF"/>
+                <w:sz w:val="15"/>
+                <w:szCs w:val="15"/>
+              </w:rPr>
+              <w:t xml:space="preserve">0.012 (NTU), 0.022 (NSYSU zero-shot)</w:t>
+            </w:r>
+          </w:p>
+        </w:tc>
+      </w:tr>
+      <w:tr>
+        <w:trPr>
+          <w:cantSplit/>
+        </w:trPr>
+        <w:tc>
+          <w:tcPr>
+            <w:tcW w:type="dxa" w:w="1877"/>
+            <w:tcMar>
+              <w:top w:type="dxa" w:w="14"/>
+              <w:left w:type="dxa" w:w="50"/>
+              <w:bottom w:type="dxa" w:w="14"/>
+              <w:right w:type="dxa" w:w="50"/>
+            </w:tcMar>
+            <w:vAlign w:val="center"/>
+          </w:tcPr>
+          <w:p>
+            <w:pPr>
+              <w:keepNext w:val="false"/>
+              <w:keepLines/>
+              <w:spacing w:after="0" w:line="210"/>
+              <w:jc w:val="left"/>
+            </w:pPr>
+            <w:r>
+              <w:rPr>
+                <w:rFonts w:ascii="Times New Roman" w:cs="Times New Roman" w:eastAsia="PMingLiU" w:hAnsi="Times New Roman"/>
+                <w:b w:val="false"/>
+                <w:bCs w:val="false"/>
+                <w:color w:val="0000FF"/>
+                <w:sz w:val="15"/>
+                <w:szCs w:val="15"/>
+              </w:rPr>
+              <w:t xml:space="preserve">NSYSU transfer</w:t>
+            </w:r>
+          </w:p>
+        </w:tc>
+        <w:tc>
+          <w:tcPr>
+            <w:tcW w:type="dxa" w:w="1300"/>
+            <w:tcMar>
+              <w:top w:type="dxa" w:w="14"/>
+              <w:left w:type="dxa" w:w="50"/>
+              <w:bottom w:type="dxa" w:w="14"/>
+              <w:right w:type="dxa" w:w="50"/>
+            </w:tcMar>
+            <w:vAlign w:val="center"/>
+          </w:tcPr>
+          <w:p>
+            <w:pPr>
+              <w:keepNext w:val="false"/>
+              <w:keepLines/>
+              <w:spacing w:after="0" w:line="210"/>
+              <w:jc w:val="left"/>
+            </w:pPr>
+            <w:r>
+              <w:rPr>
+                <w:rFonts w:ascii="Times New Roman" w:cs="Times New Roman" w:eastAsia="PMingLiU" w:hAnsi="Times New Roman"/>
+                <w:b w:val="false"/>
+                <w:bCs w:val="false"/>
+                <w:color w:val="0000FF"/>
+                <w:sz w:val="15"/>
+                <w:szCs w:val="15"/>
+              </w:rPr>
+              <w:t xml:space="preserve">zero-shot drop, closed within 5 AUC points after 2–4 weeks</w:t>
+            </w:r>
+          </w:p>
+        </w:tc>
+        <w:tc>
+          <w:tcPr>
+            <w:tcW w:type="dxa" w:w="1500"/>
+            <w:tcMar>
+              <w:top w:type="dxa" w:w="14"/>
+              <w:left w:type="dxa" w:w="50"/>
+              <w:bottom w:type="dxa" w:w="14"/>
+              <w:right w:type="dxa" w:w="50"/>
+            </w:tcMar>
+            <w:vAlign w:val="center"/>
+          </w:tcPr>
+          <w:p>
+            <w:pPr>
+              <w:keepNext w:val="false"/>
+              <w:keepLines/>
+              <w:spacing w:after="0" w:line="210"/>
+              <w:jc w:val="left"/>
+            </w:pPr>
+            <w:r>
+              <w:rPr>
+                <w:rFonts w:ascii="Times New Roman" w:cs="Times New Roman" w:eastAsia="PMingLiU" w:hAnsi="Times New Roman"/>
+                <w:b w:val="false"/>
+                <w:bCs w:val="false"/>
+                <w:color w:val="0000FF"/>
+                <w:sz w:val="15"/>
+                <w:szCs w:val="15"/>
+              </w:rPr>
+              <w:t xml:space="preserve">no drop: 0.934 zero-shot vs. 0.940 with 6 local days</w:t>
+            </w:r>
+          </w:p>
+        </w:tc>
+      </w:tr>
+      <w:tr>
+        <w:trPr>
+          <w:cantSplit/>
+        </w:trPr>
+        <w:tc>
+          <w:tcPr>
+            <w:tcW w:type="dxa" w:w="1877"/>
+            <w:tcMar>
+              <w:top w:type="dxa" w:w="14"/>
+              <w:left w:type="dxa" w:w="50"/>
+              <w:bottom w:type="dxa" w:w="14"/>
+              <w:right w:type="dxa" w:w="50"/>
+            </w:tcMar>
+            <w:vAlign w:val="center"/>
+          </w:tcPr>
+          <w:p>
+            <w:pPr>
+              <w:keepNext w:val="false"/>
+              <w:keepLines/>
+              <w:spacing w:after="0" w:line="210"/>
+              <w:jc w:val="left"/>
+            </w:pPr>
+            <w:r>
+              <w:rPr>
+                <w:rFonts w:ascii="Times New Roman" w:cs="Times New Roman" w:eastAsia="PMingLiU" w:hAnsi="Times New Roman"/>
+                <w:b w:val="false"/>
+                <w:bCs w:val="false"/>
+                <w:color w:val="0000FF"/>
+                <w:sz w:val="15"/>
+                <w:szCs w:val="15"/>
+              </w:rPr>
+              <w:t xml:space="preserve">Unmet rentals avoided, reactive</w:t>
+            </w:r>
+          </w:p>
+        </w:tc>
+        <w:tc>
+          <w:tcPr>
+            <w:tcW w:type="dxa" w:w="1300"/>
+            <w:tcMar>
+              <w:top w:type="dxa" w:w="14"/>
+              <w:left w:type="dxa" w:w="50"/>
+              <w:bottom w:type="dxa" w:w="14"/>
+              <w:right w:type="dxa" w:w="50"/>
+            </w:tcMar>
+            <w:vAlign w:val="center"/>
+          </w:tcPr>
+          <w:p>
+            <w:pPr>
+              <w:keepNext w:val="false"/>
+              <w:keepLines/>
+              <w:spacing w:after="0" w:line="210"/>
+              <w:jc w:val="left"/>
+            </w:pPr>
+            <w:r>
+              <w:rPr>
+                <w:rFonts w:ascii="Times New Roman" w:cs="Times New Roman" w:eastAsia="PMingLiU" w:hAnsi="Times New Roman"/>
+                <w:b w:val="false"/>
+                <w:bCs w:val="false"/>
+                <w:color w:val="0000FF"/>
+                <w:sz w:val="15"/>
+                <w:szCs w:val="15"/>
+              </w:rPr>
+              <w:t xml:space="preserve">about 20%</w:t>
+            </w:r>
+          </w:p>
+        </w:tc>
+        <w:tc>
+          <w:tcPr>
+            <w:tcW w:type="dxa" w:w="1500"/>
+            <w:tcMar>
+              <w:top w:type="dxa" w:w="14"/>
+              <w:left w:type="dxa" w:w="50"/>
+              <w:bottom w:type="dxa" w:w="14"/>
+              <w:right w:type="dxa" w:w="50"/>
+            </w:tcMar>
+            <w:vAlign w:val="center"/>
+          </w:tcPr>
+          <w:p>
+            <w:pPr>
+              <w:keepNext w:val="false"/>
+              <w:keepLines/>
+              <w:spacing w:after="0" w:line="210"/>
+              <w:jc w:val="left"/>
+            </w:pPr>
+            <w:r>
+              <w:rPr>
+                <w:rFonts w:ascii="Times New Roman" w:cs="Times New Roman" w:eastAsia="PMingLiU" w:hAnsi="Times New Roman"/>
+                <w:b w:val="false"/>
+                <w:bCs w:val="false"/>
+                <w:color w:val="0000FF"/>
+                <w:sz w:val="15"/>
+                <w:szCs w:val="15"/>
+              </w:rPr>
+              <w:t xml:space="preserve">7% / 17% / 26% with 1 / 3 / 6 trucks</w:t>
+            </w:r>
+          </w:p>
+        </w:tc>
+      </w:tr>
+      <w:tr>
+        <w:trPr>
+          <w:cantSplit/>
+        </w:trPr>
+        <w:tc>
+          <w:tcPr>
+            <w:tcW w:type="dxa" w:w="1877"/>
+            <w:tcMar>
+              <w:top w:type="dxa" w:w="14"/>
+              <w:left w:type="dxa" w:w="50"/>
+              <w:bottom w:type="dxa" w:w="14"/>
+              <w:right w:type="dxa" w:w="50"/>
+            </w:tcMar>
+            <w:vAlign w:val="center"/>
+          </w:tcPr>
+          <w:p>
+            <w:pPr>
+              <w:keepNext w:val="false"/>
+              <w:keepLines/>
+              <w:spacing w:after="0" w:line="210"/>
+              <w:jc w:val="left"/>
+            </w:pPr>
+            <w:r>
+              <w:rPr>
+                <w:rFonts w:ascii="Times New Roman" w:cs="Times New Roman" w:eastAsia="PMingLiU" w:hAnsi="Times New Roman"/>
+                <w:b w:val="false"/>
+                <w:bCs w:val="false"/>
+                <w:color w:val="0000FF"/>
+                <w:sz w:val="15"/>
+                <w:szCs w:val="15"/>
+              </w:rPr>
+              <w:t xml:space="preserve">Unmet rentals avoided, point forecast</w:t>
+            </w:r>
+          </w:p>
+        </w:tc>
+        <w:tc>
+          <w:tcPr>
+            <w:tcW w:type="dxa" w:w="1300"/>
+            <w:tcMar>
+              <w:top w:type="dxa" w:w="14"/>
+              <w:left w:type="dxa" w:w="50"/>
+              <w:bottom w:type="dxa" w:w="14"/>
+              <w:right w:type="dxa" w:w="50"/>
+            </w:tcMar>
+            <w:vAlign w:val="center"/>
+          </w:tcPr>
+          <w:p>
+            <w:pPr>
+              <w:keepNext w:val="false"/>
+              <w:keepLines/>
+              <w:spacing w:after="0" w:line="210"/>
+              <w:jc w:val="left"/>
+            </w:pPr>
+            <w:r>
+              <w:rPr>
+                <w:rFonts w:ascii="Times New Roman" w:cs="Times New Roman" w:eastAsia="PMingLiU" w:hAnsi="Times New Roman"/>
+                <w:b w:val="false"/>
+                <w:bCs w:val="false"/>
+                <w:color w:val="0000FF"/>
+                <w:sz w:val="15"/>
+                <w:szCs w:val="15"/>
+              </w:rPr>
+              <w:t xml:space="preserve">about 40%</w:t>
+            </w:r>
+          </w:p>
+        </w:tc>
+        <w:tc>
+          <w:tcPr>
+            <w:tcW w:type="dxa" w:w="1500"/>
+            <w:tcMar>
+              <w:top w:type="dxa" w:w="14"/>
+              <w:left w:type="dxa" w:w="50"/>
+              <w:bottom w:type="dxa" w:w="14"/>
+              <w:right w:type="dxa" w:w="50"/>
+            </w:tcMar>
+            <w:vAlign w:val="center"/>
+          </w:tcPr>
+          <w:p>
+            <w:pPr>
+              <w:keepNext w:val="false"/>
+              <w:keepLines/>
+              <w:spacing w:after="0" w:line="210"/>
+              <w:jc w:val="left"/>
+            </w:pPr>
+            <w:r>
+              <w:rPr>
+                <w:rFonts w:ascii="Times New Roman" w:cs="Times New Roman" w:eastAsia="PMingLiU" w:hAnsi="Times New Roman"/>
+                <w:b w:val="false"/>
+                <w:bCs w:val="false"/>
+                <w:color w:val="0000FF"/>
+                <w:sz w:val="15"/>
+                <w:szCs w:val="15"/>
+              </w:rPr>
+              <w:t xml:space="preserve">5% / 16% / 25%</w:t>
+            </w:r>
+          </w:p>
+        </w:tc>
+      </w:tr>
+      <w:tr>
+        <w:trPr>
+          <w:cantSplit/>
+        </w:trPr>
+        <w:tc>
+          <w:tcPr>
+            <w:tcW w:type="dxa" w:w="1877"/>
+            <w:tcMar>
+              <w:top w:type="dxa" w:w="14"/>
+              <w:left w:type="dxa" w:w="50"/>
+              <w:bottom w:type="dxa" w:w="14"/>
+              <w:right w:type="dxa" w:w="50"/>
+            </w:tcMar>
+            <w:vAlign w:val="center"/>
+          </w:tcPr>
+          <w:p>
+            <w:pPr>
+              <w:keepNext w:val="false"/>
+              <w:keepLines/>
+              <w:spacing w:after="0" w:line="210"/>
+              <w:jc w:val="left"/>
+            </w:pPr>
+            <w:r>
+              <w:rPr>
+                <w:rFonts w:ascii="Times New Roman" w:cs="Times New Roman" w:eastAsia="PMingLiU" w:hAnsi="Times New Roman"/>
+                <w:b w:val="false"/>
+                <w:bCs w:val="false"/>
+                <w:color w:val="0000FF"/>
+                <w:sz w:val="15"/>
+                <w:szCs w:val="15"/>
+              </w:rPr>
+              <w:t xml:space="preserve">Unmet rentals avoided, probabilistic</w:t>
+            </w:r>
+          </w:p>
+        </w:tc>
+        <w:tc>
+          <w:tcPr>
+            <w:tcW w:type="dxa" w:w="1300"/>
+            <w:tcMar>
+              <w:top w:type="dxa" w:w="14"/>
+              <w:left w:type="dxa" w:w="50"/>
+              <w:bottom w:type="dxa" w:w="14"/>
+              <w:right w:type="dxa" w:w="50"/>
+            </w:tcMar>
+            <w:vAlign w:val="center"/>
+          </w:tcPr>
+          <w:p>
+            <w:pPr>
+              <w:keepNext w:val="false"/>
+              <w:keepLines/>
+              <w:spacing w:after="0" w:line="210"/>
+              <w:jc w:val="left"/>
+            </w:pPr>
+            <w:r>
+              <w:rPr>
+                <w:rFonts w:ascii="Times New Roman" w:cs="Times New Roman" w:eastAsia="PMingLiU" w:hAnsi="Times New Roman"/>
+                <w:b w:val="false"/>
+                <w:bCs w:val="false"/>
+                <w:color w:val="0000FF"/>
+                <w:sz w:val="15"/>
+                <w:szCs w:val="15"/>
+              </w:rPr>
+              <w:t xml:space="preserve">about 50%</w:t>
+            </w:r>
+          </w:p>
+        </w:tc>
+        <w:tc>
+          <w:tcPr>
+            <w:tcW w:type="dxa" w:w="1500"/>
+            <w:tcMar>
+              <w:top w:type="dxa" w:w="14"/>
+              <w:left w:type="dxa" w:w="50"/>
+              <w:bottom w:type="dxa" w:w="14"/>
+              <w:right w:type="dxa" w:w="50"/>
+            </w:tcMar>
+            <w:vAlign w:val="center"/>
+          </w:tcPr>
+          <w:p>
+            <w:pPr>
+              <w:keepNext w:val="false"/>
+              <w:keepLines/>
+              <w:spacing w:after="0" w:line="210"/>
+              <w:jc w:val="left"/>
+            </w:pPr>
+            <w:r>
+              <w:rPr>
+                <w:rFonts w:ascii="Times New Roman" w:cs="Times New Roman" w:eastAsia="PMingLiU" w:hAnsi="Times New Roman"/>
+                <w:b w:val="false"/>
+                <w:bCs w:val="false"/>
+                <w:color w:val="0000FF"/>
+                <w:sz w:val="15"/>
+                <w:szCs w:val="15"/>
+              </w:rPr>
+              <w:t xml:space="preserve">8% / 17% / 27%; operator replay 61%</w:t>
+            </w:r>
+          </w:p>
+        </w:tc>
+      </w:tr>
+    </w:tbl>
+    <w:p>
+      <w:pPr>
+        <w:spacing w:after="80" w:before="0" w:line="120"/>
+      </w:pPr>
+      <w:r>
+        <w:rPr>
+          <w:rFonts w:ascii="Times New Roman" w:cs="Times New Roman" w:eastAsia="PMingLiU" w:hAnsi="Times New Roman"/>
+          <w:sz w:val="6"/>
+          <w:szCs w:val="6"/>
+        </w:rPr>
+        <w:t xml:space="preserve"/>
+      </w:r>
+    </w:p>
+    <w:p>
+      <w:pPr>
+        <w:spacing w:after="0" w:line="240"/>
+        <w:ind w:firstLine="288"/>
+        <w:jc w:val="both"/>
+      </w:pPr>
+      <w:r>
+        <w:rPr>
+          <w:rFonts w:ascii="Times New Roman" w:cs="Times New Roman" w:eastAsia="PMingLiU" w:hAnsi="Times New Roman"/>
+          <w:color w:val="0000FF"/>
+          <w:sz w:val="20"/>
+          <w:szCs w:val="20"/>
+        </w:rPr>
+        <w:t xml:space="preserve">Fig. 13 updates the schedule: data pipeline and demand reconstruction are complete, the predictor is trained and transferred ahead of plan, and the simulator exists two weeks early, with the planner still greedy. Of the proposal’s three fallbacks, none was needed: Kaohsiung history is being collected by our own logger, the probabilistic policy does beat the point forecast, and local search is on schedule. Remaining work:</w:t>
       </w:r>
     </w:p>
     <w:p>
@@ -10913,7 +12197,7 @@
           <w:sz w:val="20"/>
           <w:szCs w:val="20"/>
         </w:rPr>
-        <w:t xml:space="preserve">the live NSYSU demo (Fig. 11) and, after four more weeks of logging, a transfer study by week of local data.</w:t>
+        <w:t xml:space="preserve">the live NSYSU demo (Fig. 12) and, after four more weeks of logging, a transfer study by week of local data.</w:t>
       </w:r>
     </w:p>
     <w:p>
@@ -10926,77 +12210,6 @@
         <w:drawing>
           <wp:inline distT="0" distB="0" distL="0" distR="0">
             <wp:extent cx="2943225" cy="2486025"/>
-            <wp:effectExtent t="0" r="0" b="0" l="0"/>
-            <wp:docPr id="1" name="" descr="" title=""/>
-            <wp:cNvGraphicFramePr>
-              <a:graphicFrameLocks xmlns:a="http://schemas.openxmlformats.org/drawingml/2006/main" noChangeAspect="1"/>
-            </wp:cNvGraphicFramePr>
-            <a:graphic xmlns:a="http://schemas.openxmlformats.org/drawingml/2006/main">
-              <a:graphicData uri="http://schemas.openxmlformats.org/drawingml/2006/picture">
-                <pic:pic xmlns:pic="http://schemas.openxmlformats.org/drawingml/2006/picture">
-                  <pic:nvPicPr>
-                    <pic:cNvPr id="0" name="" descr=""/>
-                    <pic:cNvPicPr>
-                      <a:picLocks noChangeAspect="1" noChangeArrowheads="1"/>
-                    </pic:cNvPicPr>
-                  </pic:nvPicPr>
-                  <pic:blipFill>
-                    <a:blip r:embed="rId17" cstate="none"/>
-                    <a:srcRect/>
-                    <a:stretch>
-                      <a:fillRect/>
-                    </a:stretch>
-                  </pic:blipFill>
-                  <pic:spPr bwMode="auto">
-                    <a:xfrm>
-                      <a:off x="0" y="0"/>
-                      <a:ext cx="2943225" cy="2486025"/>
-                    </a:xfrm>
-                    <a:prstGeom prst="rect">
-                      <a:avLst/>
-                    </a:prstGeom>
-                  </pic:spPr>
-                </pic:pic>
-              </a:graphicData>
-            </a:graphic>
-          </wp:inline>
-        </w:drawing>
-      </w:r>
-    </w:p>
-    <w:p>
-      <w:pPr>
-        <w:spacing w:after="140" w:before="0" w:line="200"/>
-        <w:jc w:val="both"/>
-      </w:pPr>
-      <w:r>
-        <w:rPr>
-          <w:rFonts w:ascii="Times New Roman" w:cs="Times New Roman" w:eastAsia="PMingLiU" w:hAnsi="Times New Roman"/>
-          <w:b/>
-          <w:bCs/>
-          <w:sz w:val="17"/>
-          <w:szCs w:val="17"/>
-        </w:rPr>
-        <w:t xml:space="preserve">Figure 11. </w:t>
-      </w:r>
-      <w:r>
-        <w:rPr>
-          <w:rFonts w:ascii="Times New Roman" w:cs="Times New Roman" w:eastAsia="PMingLiU" w:hAnsi="Times New Roman"/>
-          <w:sz w:val="17"/>
-          <w:szCs w:val="17"/>
-        </w:rPr>
-        <w:t xml:space="preserve">Mock-up of the live NSYSU demo (from the proposal; real station positions and stock, probabilities and route illustrative).</w:t>
-      </w:r>
-    </w:p>
-    <w:p>
-      <w:pPr>
-        <w:keepNext/>
-        <w:spacing w:after="40" w:before="120"/>
-        <w:jc w:val="center"/>
-      </w:pPr>
-      <w:r>
-        <w:drawing>
-          <wp:inline distT="0" distB="0" distL="0" distR="0">
-            <wp:extent cx="2943225" cy="1628775"/>
             <wp:effectExtent t="0" r="0" b="0" l="0"/>
             <wp:docPr id="1" name="" descr="" title=""/>
             <wp:cNvGraphicFramePr>
@@ -11021,6 +12234,77 @@
                   <pic:spPr bwMode="auto">
                     <a:xfrm>
                       <a:off x="0" y="0"/>
+                      <a:ext cx="2943225" cy="2486025"/>
+                    </a:xfrm>
+                    <a:prstGeom prst="rect">
+                      <a:avLst/>
+                    </a:prstGeom>
+                  </pic:spPr>
+                </pic:pic>
+              </a:graphicData>
+            </a:graphic>
+          </wp:inline>
+        </w:drawing>
+      </w:r>
+    </w:p>
+    <w:p>
+      <w:pPr>
+        <w:spacing w:after="140" w:before="0" w:line="200"/>
+        <w:jc w:val="both"/>
+      </w:pPr>
+      <w:r>
+        <w:rPr>
+          <w:rFonts w:ascii="Times New Roman" w:cs="Times New Roman" w:eastAsia="PMingLiU" w:hAnsi="Times New Roman"/>
+          <w:b/>
+          <w:bCs/>
+          <w:sz w:val="17"/>
+          <w:szCs w:val="17"/>
+        </w:rPr>
+        <w:t xml:space="preserve">Figure 12. </w:t>
+      </w:r>
+      <w:r>
+        <w:rPr>
+          <w:rFonts w:ascii="Times New Roman" w:cs="Times New Roman" w:eastAsia="PMingLiU" w:hAnsi="Times New Roman"/>
+          <w:sz w:val="17"/>
+          <w:szCs w:val="17"/>
+        </w:rPr>
+        <w:t xml:space="preserve">Mock-up of the live NSYSU demo (from the proposal; real station positions and stock, probabilities and route illustrative).</w:t>
+      </w:r>
+    </w:p>
+    <w:p>
+      <w:pPr>
+        <w:keepNext/>
+        <w:spacing w:after="40" w:before="120"/>
+        <w:jc w:val="center"/>
+      </w:pPr>
+      <w:r>
+        <w:drawing>
+          <wp:inline distT="0" distB="0" distL="0" distR="0">
+            <wp:extent cx="2943225" cy="1628775"/>
+            <wp:effectExtent t="0" r="0" b="0" l="0"/>
+            <wp:docPr id="1" name="" descr="" title=""/>
+            <wp:cNvGraphicFramePr>
+              <a:graphicFrameLocks xmlns:a="http://schemas.openxmlformats.org/drawingml/2006/main" noChangeAspect="1"/>
+            </wp:cNvGraphicFramePr>
+            <a:graphic xmlns:a="http://schemas.openxmlformats.org/drawingml/2006/main">
+              <a:graphicData uri="http://schemas.openxmlformats.org/drawingml/2006/picture">
+                <pic:pic xmlns:pic="http://schemas.openxmlformats.org/drawingml/2006/picture">
+                  <pic:nvPicPr>
+                    <pic:cNvPr id="0" name="" descr=""/>
+                    <pic:cNvPicPr>
+                      <a:picLocks noChangeAspect="1" noChangeArrowheads="1"/>
+                    </pic:cNvPicPr>
+                  </pic:nvPicPr>
+                  <pic:blipFill>
+                    <a:blip r:embed="rId19" cstate="none"/>
+                    <a:srcRect/>
+                    <a:stretch>
+                      <a:fillRect/>
+                    </a:stretch>
+                  </pic:blipFill>
+                  <pic:spPr bwMode="auto">
+                    <a:xfrm>
+                      <a:off x="0" y="0"/>
                       <a:ext cx="2943225" cy="1628775"/>
                     </a:xfrm>
                     <a:prstGeom prst="rect">
@@ -11048,7 +12332,7 @@
           <w:sz w:val="17"/>
           <w:szCs w:val="17"/>
         </w:rPr>
-        <w:t xml:space="preserve">Figure 12. </w:t>
+        <w:t xml:space="preserve">Figure 13. </w:t>
       </w:r>
       <w:r>
         <w:rPr>

</xml_diff>

<commit_message>
HW3 v8 (submission candidate): every black passage verbatim from HW1
- headings 1.4, 2.3, 2.4, 2.6: HW1 words in black, new numbers and words in blue
- captions of Figs. 1, 2 and the demo mock-up restored to the HW1 wording
- Sec. 1.2 lists the four horizons actually used (30/60/90/120 min)
- Sec. 3.1 run times, Sec. 3.4 bootstrap wording, Sec. 3.3 plausibility sentence
  (no comparison across different years; reference [27] dropped)

Co-Authored-By: Claude Opus 5.5 <noreply@anthropic.com>
Claude-Session: https://claude.ai/code/session_01QFP6ssei1RRu2jM5wMNLRo
</commit_message>
<xml_diff>
--- a/report/HW3_54.docx
+++ b/report/HW3_54.docx
@@ -999,7 +999,7 @@
           <w:sz w:val="20"/>
           <w:szCs w:val="20"/>
         </w:rPr>
-        <w:t xml:space="preserve"> ∈ {30, 60} min. </w:t>
+        <w:t xml:space="preserve"> ∈ {30, 60, 90, 120} min. </w:t>
       </w:r>
       <w:r>
         <w:rPr>
@@ -1131,7 +1131,7 @@
           <w:sz w:val="17"/>
           <w:szCs w:val="17"/>
         </w:rPr>
-        <w:t xml:space="preserve">Class-end stockouts are real and predictable (from the proposal). (a) Mean bikes available at 59 NTU campus stations over 20 weekdays, Mar 2025 [2]; the strip shows the share of empty stations. (b) NSYSU at 17:12, 28 Sep 2026 [12].</w:t>
+        <w:t xml:space="preserve">Class-end stockouts are real and predictable. (a) Mean bikes available at 59 NTU campus stations over 20 weekdays, Mar 2025 [2]; orange = period ends; strip = share of empty stations. (b) NSYSU at 17:12, 28 Sep 2026 [12].</w:t>
       </w:r>
     </w:p>
     <w:p>
@@ -1187,7 +1187,18 @@
           <w:sz w:val="22"/>
           <w:szCs w:val="22"/>
         </w:rPr>
-        <w:t xml:space="preserve">1.4. Proposed solution and status</w:t>
+        <w:t xml:space="preserve">1.4. Proposed solution</w:t>
+      </w:r>
+      <w:r>
+        <w:rPr>
+          <w:rFonts w:ascii="Times New Roman" w:cs="Times New Roman" w:eastAsia="PMingLiU" w:hAnsi="Times New Roman"/>
+          <w:b/>
+          <w:bCs/>
+          <w:color w:val="0000FF"/>
+          <w:sz w:val="22"/>
+          <w:szCs w:val="22"/>
+        </w:rPr>
+        <w:t xml:space="preserve"> and status</w:t>
       </w:r>
     </w:p>
     <w:p>
@@ -1349,7 +1360,7 @@
           <w:sz w:val="17"/>
           <w:szCs w:val="17"/>
         </w:rPr>
-        <w:t xml:space="preserve">Proposed pipeline and the course unit each stage exercises (from the proposal).</w:t>
+        <w:t xml:space="preserve">Proposed pipeline and the course unit each stage exercises.</w:t>
       </w:r>
     </w:p>
     <w:p>
@@ -1593,10 +1604,32 @@
           <w:rFonts w:ascii="Times New Roman" w:cs="Times New Roman" w:eastAsia="PMingLiU" w:hAnsi="Times New Roman"/>
           <w:b/>
           <w:bCs/>
+          <w:color w:val="0000FF"/>
           <w:sz w:val="22"/>
           <w:szCs w:val="22"/>
         </w:rPr>
-        <w:t xml:space="preserve">2.3. Demand reconstruction and operator inference</w:t>
+        <w:t xml:space="preserve">2.3.</w:t>
+      </w:r>
+      <w:r>
+        <w:rPr>
+          <w:rFonts w:ascii="Times New Roman" w:cs="Times New Roman" w:eastAsia="PMingLiU" w:hAnsi="Times New Roman"/>
+          <w:b/>
+          <w:bCs/>
+          <w:sz w:val="22"/>
+          <w:szCs w:val="22"/>
+        </w:rPr>
+        <w:t xml:space="preserve"> Demand reconstruction</w:t>
+      </w:r>
+      <w:r>
+        <w:rPr>
+          <w:rFonts w:ascii="Times New Roman" w:cs="Times New Roman" w:eastAsia="PMingLiU" w:hAnsi="Times New Roman"/>
+          <w:b/>
+          <w:bCs/>
+          <w:color w:val="0000FF"/>
+          <w:sz w:val="22"/>
+          <w:szCs w:val="22"/>
+        </w:rPr>
+        <w:t xml:space="preserve"> and operator inference</w:t>
       </w:r>
     </w:p>
     <w:p>
@@ -2787,10 +2820,21 @@
           <w:rFonts w:ascii="Times New Roman" w:cs="Times New Roman" w:eastAsia="PMingLiU" w:hAnsi="Times New Roman"/>
           <w:b/>
           <w:bCs/>
+          <w:color w:val="0000FF"/>
           <w:sz w:val="22"/>
           <w:szCs w:val="22"/>
         </w:rPr>
-        <w:t xml:space="preserve">2.4. Schedule-aware stockout prediction</w:t>
+        <w:t xml:space="preserve">2.4.</w:t>
+      </w:r>
+      <w:r>
+        <w:rPr>
+          <w:rFonts w:ascii="Times New Roman" w:cs="Times New Roman" w:eastAsia="PMingLiU" w:hAnsi="Times New Roman"/>
+          <w:b/>
+          <w:bCs/>
+          <w:sz w:val="22"/>
+          <w:szCs w:val="22"/>
+        </w:rPr>
+        <w:t xml:space="preserve"> Schedule-aware stockout prediction</w:t>
       </w:r>
     </w:p>
     <w:p>
@@ -4520,10 +4564,32 @@
           <w:rFonts w:ascii="Times New Roman" w:cs="Times New Roman" w:eastAsia="PMingLiU" w:hAnsi="Times New Roman"/>
           <w:b/>
           <w:bCs/>
+          <w:color w:val="0000FF"/>
           <w:sz w:val="22"/>
           <w:szCs w:val="22"/>
         </w:rPr>
-        <w:t xml:space="preserve">2.6. Pre-emptive planner and replay simulator</w:t>
+        <w:t xml:space="preserve">2.6.</w:t>
+      </w:r>
+      <w:r>
+        <w:rPr>
+          <w:rFonts w:ascii="Times New Roman" w:cs="Times New Roman" w:eastAsia="PMingLiU" w:hAnsi="Times New Roman"/>
+          <w:b/>
+          <w:bCs/>
+          <w:sz w:val="22"/>
+          <w:szCs w:val="22"/>
+        </w:rPr>
+        <w:t xml:space="preserve"> Pre-emptive planner and </w:t>
+      </w:r>
+      <w:r>
+        <w:rPr>
+          <w:rFonts w:ascii="Times New Roman" w:cs="Times New Roman" w:eastAsia="PMingLiU" w:hAnsi="Times New Roman"/>
+          <w:b/>
+          <w:bCs/>
+          <w:color w:val="0000FF"/>
+          <w:sz w:val="22"/>
+          <w:szCs w:val="22"/>
+        </w:rPr>
+        <w:t xml:space="preserve">replay simulator</w:t>
       </w:r>
     </w:p>
     <w:p>
@@ -5578,7 +5644,7 @@
           <w:sz w:val="20"/>
           <w:szCs w:val="20"/>
         </w:rPr>
-        <w:t xml:space="preserve">Table 2 lists the data. NTU rows are split by time: training 1 Sep 2024–9 Mar 2025, validation 10–31 Mar 2025 (early stopping), test 1 Apr–22 Jun 2025 (1.22 M station-slots never seen by the model). NSYSU uses 2–7 Oct for training, 8–9 Oct for validation and 10–15 Oct for testing. The replay simulator uses the 28 in-semester weekdays of the test period with ≥ 95% snapshot coverage. On a 2-vCPU, 7 GB container (Python 3.11, LightGBM 4.7, scikit-learn 1.8) the feature table takes 22 s, the roll-out tables 16 s, the horizon sweep with its twelve GBMs 9 min, the bootstrap 6 min and one simulated day about 3 s.</w:t>
+        <w:t xml:space="preserve">Table 2 lists the data. NTU rows are split by time: training 1 Sep 2024–9 Mar 2025, validation 10–31 Mar 2025 (early stopping), test 1 Apr–22 Jun 2025 (1.22 M station-slots never seen by the model). NSYSU uses 2–7 Oct for training, 8–9 Oct for validation and 10–15 Oct for testing. The replay simulator uses the 28 in-semester weekdays of the test period with ≥ 95% snapshot coverage. On a 2-vCPU, 7 GB container (Python 3.11, LightGBM 4.7, scikit-learn 1.8) the feature table takes 22 s, the roll-out tables 16 s, the four 30/60-min GBMs 5 min, the horizon sweep with eight further GBMs 9 min, the bootstrap 6 min and one simulated day about 3 s.</w:t>
       </w:r>
     </w:p>
     <w:p>
@@ -6541,7 +6607,7 @@
           <w:sz w:val="20"/>
           <w:szCs w:val="20"/>
         </w:rPr>
-        <w:t xml:space="preserve">The checks of Sec. 2.3.1 (Fig. 7) support the inference with one qualification. Conservation: the area loses 600 bikes per day through trips, the flagged moves bring back 394 and the unflagged residual 185; that residual averages +0.08 bikes per station-hour, so small top-ups below the threshold are missed and the 2,550 drop-offs are a lower bound. Sensitivity: across thresholds 3–8 bikes and windows 1–6 h the drop-off volume ranges from 2,150 to 2,975 bikes per day, the share before a major bell stays at 18–20%, the peak hour is always 17:00 and the reproduction R² stays above 0.977. Jumps: 56% of flagged windows contain a ≥ 8-bike jump in the flagged direction against 8% of unflagged windows, and jumps alone sum to 2,270 bikes up and 2,210 down per day. Rates: on 14.6 k well-stocked campus station-hours of the test period, actual rentals are 12% above the naive rate but 4% above the corrected one; at 17:00–18:00 the naive rate is 17–18% low and the corrected rate within 2%. The volume is plausible: the area holds 8% of Taipei’s 1,768 stations but 11% of its 234,000 daily rentals [27], and 4,700 bike-moves per day is 240 truck loads of 20, while the operator reports moving over a thousand bikes a night from a single riverside spot [26].</w:t>
+        <w:t xml:space="preserve">The checks of Sec. 2.3.1 (Fig. 7) support the inference with one qualification. Conservation: the area loses 600 bikes per day through trips, the flagged moves bring back 394 and the unflagged residual 185; that residual averages +0.08 bikes per station-hour, so small top-ups below the threshold are missed and the 2,550 drop-offs are a lower bound. Sensitivity: across thresholds 3–8 bikes and windows 1–6 h the drop-off volume ranges from 2,150 to 2,975 bikes per day, the share before a major bell stays at 18–20%, the peak hour is always 17:00 and the reproduction R² stays above 0.977. Jumps: 56% of flagged windows contain a ≥ 8-bike jump in the flagged direction against 8% of unflagged windows, and jumps alone sum to 2,270 bikes up and 2,210 down per day. Rates: on 14.6 k well-stocked campus station-hours of the test period, actual rentals are 12% above the naive rate but 4% above the corrected one; at 17:00–18:00 the naive rate is 17–18% low and the corrected rate within 2%. The volume is plausible: 4,700 bike-moves per day is about 240 truck loads of 20 in the 1.2-km area, and a press report on the operator’s crews describes over a thousand bikes collecting at riverside stations in a single day and being trucked back overnight [26].</w:t>
       </w:r>
     </w:p>
     <w:p>
@@ -6574,7 +6640,7 @@
           <w:sz w:val="20"/>
           <w:szCs w:val="20"/>
         </w:rPr>
-        <w:t xml:space="preserve">Tables 3–4 and Fig. 8 give the test results on the 1.09 M test slots whose current stock is observed. At the 30-minute horizon the full model reaches AUC 0.932 and Brier 0.080, against 0.819 / 0.126 for the seasonal baseline and 0.744 / 0.124 for persistence; the inventory-only model is close behind (0.922 / 0.084), so trip flows add little once the current stock and its trend are known, at this horizon. Calibration is good without post-processing: ECE 0.012 and a reliability curve on the diagonal up to p = 0.9 (Fig. 8a), while the seasonal baseline under-predicts at high probabilities. Performance is higher on campus stations (AUC 0.946) and lower in the 40 minutes after a major bell (0.906), where the surge is fastest. The day-level bootstrap gives half-widths of about 0.005 AUC for the GBMs and one-sided paired differences: full against inventory-only +0.010 [0.009, 0.011], inventory-only against logistic +0.007 [0.006, 0.007] and against the corrected roll-out +0.027 [0.025, 0.029].</w:t>
+        <w:t xml:space="preserve">Tables 3–4 and Fig. 8 give the test results on the 1.09 M test slots whose current stock is observed. At the 30-minute horizon the full model reaches AUC 0.932 and Brier 0.080, against 0.819 / 0.126 for the seasonal baseline and 0.744 / 0.124 for persistence; the inventory-only model is close behind (0.922 / 0.084), so trip flows add little once the current stock and its trend are known, at this horizon. Calibration is good without post-processing: ECE 0.012 and a reliability curve on the diagonal up to p = 0.9 (Fig. 8a), while the seasonal baseline under-predicts at high probabilities. Performance is higher on campus stations (AUC 0.946) and lower in the 40 minutes after a major bell (0.906), where the surge is fastest. The day-level bootstrap gives half-widths of about 0.005 AUC for the GBMs, and every paired difference has an interval that excludes zero: full against inventory-only +0.010 [0.009, 0.011], inventory-only against logistic +0.007 [0.006, 0.007] and against the corrected roll-out +0.027 [0.025, 0.029].</w:t>
       </w:r>
     </w:p>
     <w:p>
@@ -13792,6 +13858,7 @@
           <w:rFonts w:ascii="Times New Roman" w:cs="Times New Roman" w:eastAsia="PMingLiU" w:hAnsi="Times New Roman"/>
           <w:b/>
           <w:bCs/>
+          <w:color w:val="0000FF"/>
           <w:sz w:val="17"/>
           <w:szCs w:val="17"/>
         </w:rPr>
@@ -13803,7 +13870,7 @@
           <w:sz w:val="17"/>
           <w:szCs w:val="17"/>
         </w:rPr>
-        <w:t xml:space="preserve">Mock-up of the live NSYSU demo (from the proposal; real station positions and stock, probabilities and route illustrative).</w:t>
+        <w:t xml:space="preserve">Mock-up of the live NSYSU demo (real station positions and stock; probabilities and route illustrative).</w:t>
       </w:r>
     </w:p>
     <w:p>
@@ -14446,31 +14513,6 @@
           <w:szCs w:val="15"/>
         </w:rPr>
         <w:t xml:space="preserve">嚴文廷. 維繫台北街道的微笑風景──YouBike 調度員與維修員的工作日常. 報導者, 6 Apr. 2024.</w:t>
-      </w:r>
-    </w:p>
-    <w:p>
-      <w:pPr>
-        <w:spacing w:after="0" w:line="190"/>
-        <w:ind w:left="260" w:hanging="260"/>
-        <w:jc w:val="both"/>
-      </w:pPr>
-      <w:r>
-        <w:rPr>
-          <w:rFonts w:ascii="Times New Roman" w:cs="Times New Roman" w:eastAsia="PMingLiU" w:hAnsi="Times New Roman"/>
-          <w:color w:val="0000FF"/>
-          <w:sz w:val="15"/>
-          <w:szCs w:val="15"/>
-        </w:rPr>
-        <w:t xml:space="preserve">[27] </w:t>
-      </w:r>
-      <w:r>
-        <w:rPr>
-          <w:rFonts w:ascii="Times New Roman" w:cs="Times New Roman" w:eastAsia="PMingLiU" w:hAnsi="Times New Roman"/>
-          <w:color w:val="0000FF"/>
-          <w:sz w:val="15"/>
-          <w:szCs w:val="15"/>
-        </w:rPr>
-        <w:t xml:space="preserve">楊正海. 北市 YouBike 日均租借破 23 萬次創新高. 聯合新聞網, 29 Jul. 2026.</w:t>
       </w:r>
     </w:p>
     <w:sectPr>

</xml_diff>